<commit_message>
Input deel massa archivering klaar
</commit_message>
<xml_diff>
--- a/docs/Specificaties Archie V1p4.docx
+++ b/docs/Specificaties Archie V1p4.docx
@@ -81,25 +81,31 @@
         <w:rPr>
           <w:rFonts w:ascii="Calibri" w:eastAsia="Calibri" w:hAnsi="Calibri" w:cs="Times New Roman"/>
           <w:noProof/>
-          <w:kern w:val="0"/>
-          <w:sz w:val="22"/>
-          <w:szCs w:val="22"/>
-          <w14:ligatures w14:val="none"/>
+          <w:sz w:val="22"/>
+          <w:szCs w:val="22"/>
         </w:rPr>
         <mc:AlternateContent>
           <mc:Choice Requires="wps">
             <w:drawing>
-              <wp:anchor distT="45720" distB="45720" distL="114300" distR="114300" simplePos="0" relativeHeight="251658240" behindDoc="0" locked="0" layoutInCell="1" allowOverlap="1" wp14:anchorId="78146F0F" wp14:editId="69558DA3">
+              <wp:anchor distT="45720" distB="45720" distL="114300" distR="114300" simplePos="0" relativeHeight="251672588" behindDoc="1" locked="0" layoutInCell="1" allowOverlap="1" wp14:anchorId="0F30B2B3" wp14:editId="5A44439C">
                 <wp:simplePos x="0" y="0"/>
                 <wp:positionH relativeFrom="margin">
-                  <wp:align>left</wp:align>
+                  <wp:posOffset>0</wp:posOffset>
                 </wp:positionH>
                 <wp:positionV relativeFrom="paragraph">
-                  <wp:posOffset>452755</wp:posOffset>
+                  <wp:posOffset>250825</wp:posOffset>
                 </wp:positionV>
-                <wp:extent cx="1866900" cy="2506980"/>
-                <wp:effectExtent l="0" t="0" r="0" b="7620"/>
-                <wp:wrapSquare wrapText="bothSides"/>
+                <wp:extent cx="1767840" cy="1562100"/>
+                <wp:effectExtent l="0" t="0" r="3810" b="0"/>
+                <wp:wrapTight wrapText="bothSides">
+                  <wp:wrapPolygon edited="0">
+                    <wp:start x="0" y="0"/>
+                    <wp:lineTo x="0" y="21337"/>
+                    <wp:lineTo x="21414" y="21337"/>
+                    <wp:lineTo x="21414" y="0"/>
+                    <wp:lineTo x="0" y="0"/>
+                  </wp:wrapPolygon>
+                </wp:wrapTight>
                 <wp:docPr id="19121062" name="Tekstvak 9"/>
                 <wp:cNvGraphicFramePr>
                   <a:graphicFrameLocks xmlns:a="http://schemas.openxmlformats.org/drawingml/2006/main"/>
@@ -113,7 +119,7 @@
                       <wps:spPr bwMode="auto">
                         <a:xfrm>
                           <a:off x="0" y="0"/>
-                          <a:ext cx="1866900" cy="2506980"/>
+                          <a:ext cx="1767840" cy="1562100"/>
                         </a:xfrm>
                         <a:prstGeom prst="rect">
                           <a:avLst/>
@@ -136,6 +142,8 @@
                             <w:pPr>
                               <w:jc w:val="right"/>
                               <w:rPr>
+                                <w:sz w:val="18"/>
+                                <w:szCs w:val="18"/>
                                 <w:lang w:eastAsia="nl-NL"/>
                               </w:rPr>
                             </w:pPr>
@@ -144,7 +152,7 @@
                                 <w:noProof/>
                               </w:rPr>
                               <w:drawing>
-                                <wp:inline distT="0" distB="0" distL="0" distR="0" wp14:anchorId="5D540838" wp14:editId="7BCC329E">
+                                <wp:inline distT="0" distB="0" distL="0" distR="0" wp14:anchorId="171FA600" wp14:editId="3430079F">
                                   <wp:extent cx="475615" cy="475615"/>
                                   <wp:effectExtent l="0" t="0" r="635" b="635"/>
                                   <wp:docPr id="1" name="Afbeelding 1"/>
@@ -199,30 +207,13 @@
                                 <w:lang w:eastAsia="nl-NL"/>
                               </w:rPr>
                             </w:pPr>
-                          </w:p>
-                          <w:p>
-                            <w:pPr>
+                            <w:r>
                               <w:rPr>
+                                <w:sz w:val="18"/>
+                                <w:szCs w:val="18"/>
                                 <w:lang w:eastAsia="nl-NL"/>
                               </w:rPr>
-                            </w:pPr>
-                            <w:r>
-                              <w:rPr>
-                                <w:lang w:eastAsia="nl-NL"/>
-                              </w:rPr>
-                              <w:t xml:space="preserve">De naam Archie is gekozen omdat het een Archiveringssysteem </w:t>
-                            </w:r>
-                            <w:r>
-                              <w:rPr>
-                                <w:lang w:eastAsia="nl-NL"/>
-                              </w:rPr>
-                              <w:t>betreft</w:t>
-                            </w:r>
-                            <w:r>
-                              <w:rPr>
-                                <w:lang w:eastAsia="nl-NL"/>
-                              </w:rPr>
-                              <w:t>. Én omdat Archie bekend is in de stripwereld, als de man van staal.</w:t>
+                              <w:t>De naam Archie is gekozen omdat het een Archiveringssysteem betreft. Én omdat Archie bekend is in de stripwereld, als de man van staal.</w:t>
                             </w:r>
                           </w:p>
                           <w:p>
@@ -258,17 +249,19 @@
           </mc:Choice>
           <mc:Fallback>
             <w:pict>
-              <v:shapetype w14:anchorId="78146F0F" id="_x0000_t202" coordsize="21600,21600" o:spt="202" path="m,l,21600r21600,l21600,xe">
+              <v:shapetype w14:anchorId="0F30B2B3" id="_x0000_t202" coordsize="21600,21600" o:spt="202" path="m,l,21600r21600,l21600,xe">
                 <v:stroke joinstyle="miter"/>
                 <v:path gradientshapeok="t" o:connecttype="rect"/>
               </v:shapetype>
-              <v:shape id="Tekstvak 9" o:spid="_x0000_s1026" type="#_x0000_t202" style="position:absolute;margin-left:0;margin-top:35.65pt;width:147pt;height:197.4pt;z-index:251658240;visibility:visible;mso-wrap-style:square;mso-width-percent:0;mso-height-percent:0;mso-wrap-distance-left:9pt;mso-wrap-distance-top:3.6pt;mso-wrap-distance-right:9pt;mso-wrap-distance-bottom:3.6pt;mso-position-horizontal:left;mso-position-horizontal-relative:margin;mso-position-vertical:absolute;mso-position-vertical-relative:text;mso-width-percent:0;mso-height-percent:0;mso-width-relative:margin;mso-height-relative:margin;v-text-anchor:top" o:gfxdata="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" fillcolor="#a6a6a6" stroked="f">
+              <v:shape id="Tekstvak 9" o:spid="_x0000_s1026" type="#_x0000_t202" style="position:absolute;margin-left:0;margin-top:19.75pt;width:139.2pt;height:123pt;z-index:-251643892;visibility:visible;mso-wrap-style:square;mso-width-percent:0;mso-height-percent:0;mso-wrap-distance-left:9pt;mso-wrap-distance-top:3.6pt;mso-wrap-distance-right:9pt;mso-wrap-distance-bottom:3.6pt;mso-position-horizontal:absolute;mso-position-horizontal-relative:margin;mso-position-vertical:absolute;mso-position-vertical-relative:text;mso-width-percent:0;mso-height-percent:0;mso-width-relative:margin;mso-height-relative:margin;v-text-anchor:top" o:gfxdata="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" fillcolor="#a6a6a6" stroked="f">
                 <v:textbox>
                   <w:txbxContent>
                     <w:p>
                       <w:pPr>
                         <w:jc w:val="right"/>
                         <w:rPr>
+                          <w:sz w:val="18"/>
+                          <w:szCs w:val="18"/>
                           <w:lang w:eastAsia="nl-NL"/>
                         </w:rPr>
                       </w:pPr>
@@ -277,7 +270,7 @@
                           <w:noProof/>
                         </w:rPr>
                         <w:drawing>
-                          <wp:inline distT="0" distB="0" distL="0" distR="0" wp14:anchorId="5D540838" wp14:editId="7BCC329E">
+                          <wp:inline distT="0" distB="0" distL="0" distR="0" wp14:anchorId="171FA600" wp14:editId="3430079F">
                             <wp:extent cx="475615" cy="475615"/>
                             <wp:effectExtent l="0" t="0" r="635" b="635"/>
                             <wp:docPr id="1" name="Afbeelding 1"/>
@@ -332,30 +325,13 @@
                           <w:lang w:eastAsia="nl-NL"/>
                         </w:rPr>
                       </w:pPr>
-                    </w:p>
-                    <w:p>
-                      <w:pPr>
+                      <w:r>
                         <w:rPr>
+                          <w:sz w:val="18"/>
+                          <w:szCs w:val="18"/>
                           <w:lang w:eastAsia="nl-NL"/>
                         </w:rPr>
-                      </w:pPr>
-                      <w:r>
-                        <w:rPr>
-                          <w:lang w:eastAsia="nl-NL"/>
-                        </w:rPr>
-                        <w:t xml:space="preserve">De naam Archie is gekozen omdat het een Archiveringssysteem </w:t>
-                      </w:r>
-                      <w:r>
-                        <w:rPr>
-                          <w:lang w:eastAsia="nl-NL"/>
-                        </w:rPr>
-                        <w:t>betreft</w:t>
-                      </w:r>
-                      <w:r>
-                        <w:rPr>
-                          <w:lang w:eastAsia="nl-NL"/>
-                        </w:rPr>
-                        <w:t>. Én omdat Archie bekend is in de stripwereld, als de man van staal.</w:t>
+                        <w:t>De naam Archie is gekozen omdat het een Archiveringssysteem betreft. Én omdat Archie bekend is in de stripwereld, als de man van staal.</w:t>
                       </w:r>
                     </w:p>
                     <w:p>
@@ -374,7 +350,7 @@
                     <w:p/>
                   </w:txbxContent>
                 </v:textbox>
-                <w10:wrap type="square" anchorx="margin"/>
+                <w10:wrap type="tight" anchorx="margin"/>
               </v:shape>
             </w:pict>
           </mc:Fallback>
@@ -2925,7 +2901,14 @@
             <w:noProof/>
             <w:webHidden/>
           </w:rPr>
-          <w:t>15</w:t>
+          <w:t>1</w:t>
+        </w:r>
+        <w:r>
+          <w:rPr>
+            <w:noProof/>
+            <w:webHidden/>
+          </w:rPr>
+          <w:t>5</w:t>
         </w:r>
         <w:r>
           <w:rPr>
@@ -7240,10 +7223,10 @@
                                   <v:path o:extrusionok="f" gradientshapeok="t" o:connecttype="rect"/>
                                   <o:lock v:ext="edit" aspectratio="t"/>
                                 </v:shapetype>
-                                <v:shape id="_x0000_i1026" type="#_x0000_t75" style="width:342.8pt;height:389.35pt">
+                                <v:shape id="_x0000_i1025" type="#_x0000_t75" style="width:342.8pt;height:389.35pt">
                                   <v:imagedata r:id="rId9" o:title=""/>
                                 </v:shape>
-                                <o:OLEObject Type="Embed" ProgID="Visio.Drawing.15" ShapeID="_x0000_i1026" DrawAspect="Content" ObjectID="_1843131323" r:id="rId10"/>
+                                <o:OLEObject Type="Embed" ProgID="Visio.Drawing.15" ShapeID="_x0000_i1025" DrawAspect="Content" ObjectID="_1849866811" r:id="rId10"/>
                               </w:object>
                             </w:r>
                           </w:p>
@@ -7254,14 +7237,27 @@
                             <w:r>
                               <w:t xml:space="preserve">Figuur </w:t>
                             </w:r>
-                            <w:fldSimple w:instr=" SEQ Figuur \* ARABIC ">
-                              <w:r>
-                                <w:rPr>
-                                  <w:noProof/>
-                                </w:rPr>
-                                <w:t>1</w:t>
-                              </w:r>
-                            </w:fldSimple>
+                            <w:r>
+                              <w:fldChar w:fldCharType="begin"/>
+                            </w:r>
+                            <w:r>
+                              <w:instrText xml:space="preserve"> SEQ Figuur \* ARABIC </w:instrText>
+                            </w:r>
+                            <w:r>
+                              <w:fldChar w:fldCharType="separate"/>
+                            </w:r>
+                            <w:r>
+                              <w:rPr>
+                                <w:noProof/>
+                              </w:rPr>
+                              <w:t>1</w:t>
+                            </w:r>
+                            <w:r>
+                              <w:rPr>
+                                <w:noProof/>
+                              </w:rPr>
+                              <w:fldChar w:fldCharType="end"/>
+                            </w:r>
                             <w:r>
                               <w:t xml:space="preserve"> "Archiveren in een huishouden"</w:t>
                             </w:r>
@@ -7300,10 +7296,10 @@
                           <w:noProof/>
                         </w:rPr>
                         <w:object w:dxaOrig="11148" w:dyaOrig="12683" w14:anchorId="67080B52">
-                          <v:shape id="_x0000_i1026" type="#_x0000_t75" style="width:342.8pt;height:389.35pt">
+                          <v:shape id="_x0000_i1025" type="#_x0000_t75" style="width:342.8pt;height:389.35pt">
                             <v:imagedata r:id="rId9" o:title=""/>
                           </v:shape>
-                          <o:OLEObject Type="Embed" ProgID="Visio.Drawing.15" ShapeID="_x0000_i1026" DrawAspect="Content" ObjectID="_1843131323" r:id="rId11"/>
+                          <o:OLEObject Type="Embed" ProgID="Visio.Drawing.15" ShapeID="_x0000_i1025" DrawAspect="Content" ObjectID="_1849866811" r:id="rId11"/>
                         </w:object>
                       </w:r>
                     </w:p>
@@ -7314,14 +7310,27 @@
                       <w:r>
                         <w:t xml:space="preserve">Figuur </w:t>
                       </w:r>
-                      <w:fldSimple w:instr=" SEQ Figuur \* ARABIC ">
-                        <w:r>
-                          <w:rPr>
-                            <w:noProof/>
-                          </w:rPr>
-                          <w:t>1</w:t>
-                        </w:r>
-                      </w:fldSimple>
+                      <w:r>
+                        <w:fldChar w:fldCharType="begin"/>
+                      </w:r>
+                      <w:r>
+                        <w:instrText xml:space="preserve"> SEQ Figuur \* ARABIC </w:instrText>
+                      </w:r>
+                      <w:r>
+                        <w:fldChar w:fldCharType="separate"/>
+                      </w:r>
+                      <w:r>
+                        <w:rPr>
+                          <w:noProof/>
+                        </w:rPr>
+                        <w:t>1</w:t>
+                      </w:r>
+                      <w:r>
+                        <w:rPr>
+                          <w:noProof/>
+                        </w:rPr>
+                        <w:fldChar w:fldCharType="end"/>
+                      </w:r>
                       <w:r>
                         <w:t xml:space="preserve"> "Archiveren in een huishouden"</w:t>
                       </w:r>
@@ -8477,49 +8486,15 @@
           <w14:ligatures w14:val="none"/>
         </w:rPr>
       </w:pPr>
-      <w:proofErr w:type="spellStart"/>
-      <w:r>
-        <w:rPr>
-          <w:rFonts w:ascii="Calibri" w:eastAsia="Calibri" w:hAnsi="Calibri" w:cs="Times New Roman"/>
-          <w:kern w:val="0"/>
-          <w:sz w:val="22"/>
-          <w:szCs w:val="22"/>
-          <w14:ligatures w14:val="none"/>
-        </w:rPr>
-        <w:t>Use</w:t>
-      </w:r>
-      <w:proofErr w:type="spellEnd"/>
-      <w:r>
-        <w:rPr>
-          <w:rFonts w:ascii="Calibri" w:eastAsia="Calibri" w:hAnsi="Calibri" w:cs="Times New Roman"/>
-          <w:kern w:val="0"/>
-          <w:sz w:val="22"/>
-          <w:szCs w:val="22"/>
-          <w14:ligatures w14:val="none"/>
-        </w:rPr>
-        <w:t xml:space="preserve"> cases brengen de functionaliteit van het systeem, het gebruik,  in beeld. De </w:t>
-      </w:r>
-      <w:proofErr w:type="spellStart"/>
-      <w:r>
-        <w:rPr>
-          <w:rFonts w:ascii="Calibri" w:eastAsia="Calibri" w:hAnsi="Calibri" w:cs="Times New Roman"/>
-          <w:kern w:val="0"/>
-          <w:sz w:val="22"/>
-          <w:szCs w:val="22"/>
-          <w14:ligatures w14:val="none"/>
-        </w:rPr>
-        <w:t>Use</w:t>
-      </w:r>
-      <w:proofErr w:type="spellEnd"/>
-      <w:r>
-        <w:rPr>
-          <w:rFonts w:ascii="Calibri" w:eastAsia="Calibri" w:hAnsi="Calibri" w:cs="Times New Roman"/>
-          <w:kern w:val="0"/>
-          <w:sz w:val="22"/>
-          <w:szCs w:val="22"/>
-          <w14:ligatures w14:val="none"/>
-        </w:rPr>
-        <w:t xml:space="preserve"> cases zijn gebaseerd op de Gebruikerseisen voor het systeem.</w:t>
+      <w:r>
+        <w:rPr>
+          <w:rFonts w:ascii="Calibri" w:eastAsia="Calibri" w:hAnsi="Calibri" w:cs="Times New Roman"/>
+          <w:kern w:val="0"/>
+          <w:sz w:val="22"/>
+          <w:szCs w:val="22"/>
+          <w14:ligatures w14:val="none"/>
+        </w:rPr>
+        <w:t>Use cases brengen de functionaliteit van het systeem, het gebruik,  in beeld. De Use cases zijn gebaseerd op de Gebruikerseisen voor het systeem.</w:t>
       </w:r>
     </w:p>
     <w:p>
@@ -8631,10 +8606,10 @@
                                 <w:noProof/>
                               </w:rPr>
                               <w:object w:dxaOrig="7416" w:dyaOrig="5843" w14:anchorId="5644788B">
-                                <v:shape id="_x0000_i1028" type="#_x0000_t75" style="width:285.15pt;height:224.95pt">
+                                <v:shape id="_x0000_i1026" type="#_x0000_t75" style="width:285.15pt;height:224.95pt">
                                   <v:imagedata r:id="rId12" o:title=""/>
                                 </v:shape>
-                                <o:OLEObject Type="Embed" ProgID="Visio.Drawing.15" ShapeID="_x0000_i1028" DrawAspect="Content" ObjectID="_1843131324" r:id="rId13"/>
+                                <o:OLEObject Type="Embed" ProgID="Visio.Drawing.15" ShapeID="_x0000_i1026" DrawAspect="Content" ObjectID="_1849866812" r:id="rId13"/>
                               </w:object>
                             </w:r>
                           </w:p>
@@ -8671,10 +8646,10 @@
                           <w:noProof/>
                         </w:rPr>
                         <w:object w:dxaOrig="7416" w:dyaOrig="5843" w14:anchorId="5644788B">
-                          <v:shape id="_x0000_i1028" type="#_x0000_t75" style="width:285.15pt;height:224.95pt">
+                          <v:shape id="_x0000_i1026" type="#_x0000_t75" style="width:285.15pt;height:224.95pt">
                             <v:imagedata r:id="rId12" o:title=""/>
                           </v:shape>
-                          <o:OLEObject Type="Embed" ProgID="Visio.Drawing.15" ShapeID="_x0000_i1028" DrawAspect="Content" ObjectID="_1843131324" r:id="rId14"/>
+                          <o:OLEObject Type="Embed" ProgID="Visio.Drawing.15" ShapeID="_x0000_i1026" DrawAspect="Content" ObjectID="_1849866812" r:id="rId14"/>
                         </w:object>
                       </w:r>
                     </w:p>
@@ -9085,10 +9060,10 @@
                                 <w:szCs w:val="22"/>
                               </w:rPr>
                               <w:object w:dxaOrig="6768" w:dyaOrig="6264" w14:anchorId="2CD631C6">
-                                <v:shape id="_x0000_i1030" type="#_x0000_t75" style="width:277.5pt;height:245.85pt">
+                                <v:shape id="_x0000_i1027" type="#_x0000_t75" style="width:277.5pt;height:245.85pt">
                                   <v:imagedata r:id="rId15" o:title=""/>
                                 </v:shape>
-                                <o:OLEObject Type="Embed" ProgID="Visio.Drawing.11" ShapeID="_x0000_i1030" DrawAspect="Content" ObjectID="_1843131325" r:id="rId16"/>
+                                <o:OLEObject Type="Embed" ProgID="Visio.Drawing.11" ShapeID="_x0000_i1027" DrawAspect="Content" ObjectID="_1849866813" r:id="rId16"/>
                               </w:object>
                             </w:r>
                           </w:p>
@@ -9099,24 +9074,29 @@
                             <w:r>
                               <w:t xml:space="preserve">Figuur </w:t>
                             </w:r>
-                            <w:fldSimple w:instr=" SEQ Figuur \* ARABIC ">
-                              <w:r>
-                                <w:rPr>
-                                  <w:noProof/>
-                                </w:rPr>
-                                <w:t>2</w:t>
-                              </w:r>
-                            </w:fldSimple>
                             <w:r>
-                              <w:t xml:space="preserve"> </w:t>
+                              <w:fldChar w:fldCharType="begin"/>
                             </w:r>
-                            <w:proofErr w:type="spellStart"/>
                             <w:r>
-                              <w:t>Use</w:t>
+                              <w:instrText xml:space="preserve"> SEQ Figuur \* ARABIC </w:instrText>
                             </w:r>
-                            <w:proofErr w:type="spellEnd"/>
                             <w:r>
-                              <w:t xml:space="preserve"> Case "Sessie".</w:t>
+                              <w:fldChar w:fldCharType="separate"/>
+                            </w:r>
+                            <w:r>
+                              <w:rPr>
+                                <w:noProof/>
+                              </w:rPr>
+                              <w:t>2</w:t>
+                            </w:r>
+                            <w:r>
+                              <w:rPr>
+                                <w:noProof/>
+                              </w:rPr>
+                              <w:fldChar w:fldCharType="end"/>
+                            </w:r>
+                            <w:r>
+                              <w:t xml:space="preserve"> Use Case "Sessie".</w:t>
                             </w:r>
                           </w:p>
                           <w:p/>
@@ -9156,10 +9136,10 @@
                           <w:szCs w:val="22"/>
                         </w:rPr>
                         <w:object w:dxaOrig="6768" w:dyaOrig="6264" w14:anchorId="2CD631C6">
-                          <v:shape id="_x0000_i1030" type="#_x0000_t75" style="width:277.5pt;height:245.85pt">
+                          <v:shape id="_x0000_i1027" type="#_x0000_t75" style="width:277.5pt;height:245.85pt">
                             <v:imagedata r:id="rId15" o:title=""/>
                           </v:shape>
-                          <o:OLEObject Type="Embed" ProgID="Visio.Drawing.11" ShapeID="_x0000_i1030" DrawAspect="Content" ObjectID="_1843131325" r:id="rId17"/>
+                          <o:OLEObject Type="Embed" ProgID="Visio.Drawing.11" ShapeID="_x0000_i1027" DrawAspect="Content" ObjectID="_1849866813" r:id="rId17"/>
                         </w:object>
                       </w:r>
                     </w:p>
@@ -9170,24 +9150,29 @@
                       <w:r>
                         <w:t xml:space="preserve">Figuur </w:t>
                       </w:r>
-                      <w:fldSimple w:instr=" SEQ Figuur \* ARABIC ">
-                        <w:r>
-                          <w:rPr>
-                            <w:noProof/>
-                          </w:rPr>
-                          <w:t>2</w:t>
-                        </w:r>
-                      </w:fldSimple>
                       <w:r>
-                        <w:t xml:space="preserve"> </w:t>
+                        <w:fldChar w:fldCharType="begin"/>
                       </w:r>
-                      <w:proofErr w:type="spellStart"/>
                       <w:r>
-                        <w:t>Use</w:t>
+                        <w:instrText xml:space="preserve"> SEQ Figuur \* ARABIC </w:instrText>
                       </w:r>
-                      <w:proofErr w:type="spellEnd"/>
                       <w:r>
-                        <w:t xml:space="preserve"> Case "Sessie".</w:t>
+                        <w:fldChar w:fldCharType="separate"/>
+                      </w:r>
+                      <w:r>
+                        <w:rPr>
+                          <w:noProof/>
+                        </w:rPr>
+                        <w:t>2</w:t>
+                      </w:r>
+                      <w:r>
+                        <w:rPr>
+                          <w:noProof/>
+                        </w:rPr>
+                        <w:fldChar w:fldCharType="end"/>
+                      </w:r>
+                      <w:r>
+                        <w:t xml:space="preserve"> Use Case "Sessie".</w:t>
                       </w:r>
                     </w:p>
                     <w:p/>
@@ -9928,10 +9913,10 @@
                                 <w:noProof/>
                               </w:rPr>
                               <w:object w:dxaOrig="10428" w:dyaOrig="6984" w14:anchorId="3147B29E">
-                                <v:shape id="_x0000_i1032" type="#_x0000_t75" style="width:427.55pt;height:273.75pt">
+                                <v:shape id="_x0000_i1028" type="#_x0000_t75" style="width:427.55pt;height:273.75pt">
                                   <v:imagedata r:id="rId18" o:title=""/>
                                 </v:shape>
-                                <o:OLEObject Type="Embed" ProgID="Visio.Drawing.11" ShapeID="_x0000_i1032" DrawAspect="Content" ObjectID="_1843131326" r:id="rId19"/>
+                                <o:OLEObject Type="Embed" ProgID="Visio.Drawing.11" ShapeID="_x0000_i1028" DrawAspect="Content" ObjectID="_1849866814" r:id="rId19"/>
                               </w:object>
                             </w:r>
                           </w:p>
@@ -9943,24 +9928,29 @@
                             <w:r>
                               <w:t xml:space="preserve">Figuur </w:t>
                             </w:r>
-                            <w:fldSimple w:instr=" SEQ Figuur \* ARABIC ">
-                              <w:r>
-                                <w:rPr>
-                                  <w:noProof/>
-                                </w:rPr>
-                                <w:t>2</w:t>
-                              </w:r>
-                            </w:fldSimple>
                             <w:r>
-                              <w:t xml:space="preserve"> </w:t>
+                              <w:fldChar w:fldCharType="begin"/>
                             </w:r>
-                            <w:proofErr w:type="spellStart"/>
                             <w:r>
-                              <w:t>Use</w:t>
+                              <w:instrText xml:space="preserve"> SEQ Figuur \* ARABIC </w:instrText>
                             </w:r>
-                            <w:proofErr w:type="spellEnd"/>
                             <w:r>
-                              <w:t xml:space="preserve"> Case "(Op)zoeken, zien en inzien".</w:t>
+                              <w:fldChar w:fldCharType="separate"/>
+                            </w:r>
+                            <w:r>
+                              <w:rPr>
+                                <w:noProof/>
+                              </w:rPr>
+                              <w:t>2</w:t>
+                            </w:r>
+                            <w:r>
+                              <w:rPr>
+                                <w:noProof/>
+                              </w:rPr>
+                              <w:fldChar w:fldCharType="end"/>
+                            </w:r>
+                            <w:r>
+                              <w:t xml:space="preserve"> Use Case "(Op)zoeken, zien en inzien".</w:t>
                             </w:r>
                             <w:bookmarkEnd w:id="16"/>
                           </w:p>
@@ -9998,10 +9988,10 @@
                           <w:noProof/>
                         </w:rPr>
                         <w:object w:dxaOrig="10428" w:dyaOrig="6984" w14:anchorId="3147B29E">
-                          <v:shape id="_x0000_i1032" type="#_x0000_t75" style="width:427.55pt;height:273.75pt">
+                          <v:shape id="_x0000_i1028" type="#_x0000_t75" style="width:427.55pt;height:273.75pt">
                             <v:imagedata r:id="rId18" o:title=""/>
                           </v:shape>
-                          <o:OLEObject Type="Embed" ProgID="Visio.Drawing.11" ShapeID="_x0000_i1032" DrawAspect="Content" ObjectID="_1843131326" r:id="rId20"/>
+                          <o:OLEObject Type="Embed" ProgID="Visio.Drawing.11" ShapeID="_x0000_i1028" DrawAspect="Content" ObjectID="_1849866814" r:id="rId20"/>
                         </w:object>
                       </w:r>
                     </w:p>
@@ -10013,24 +10003,29 @@
                       <w:r>
                         <w:t xml:space="preserve">Figuur </w:t>
                       </w:r>
-                      <w:fldSimple w:instr=" SEQ Figuur \* ARABIC ">
-                        <w:r>
-                          <w:rPr>
-                            <w:noProof/>
-                          </w:rPr>
-                          <w:t>2</w:t>
-                        </w:r>
-                      </w:fldSimple>
                       <w:r>
-                        <w:t xml:space="preserve"> </w:t>
+                        <w:fldChar w:fldCharType="begin"/>
                       </w:r>
-                      <w:proofErr w:type="spellStart"/>
                       <w:r>
-                        <w:t>Use</w:t>
+                        <w:instrText xml:space="preserve"> SEQ Figuur \* ARABIC </w:instrText>
                       </w:r>
-                      <w:proofErr w:type="spellEnd"/>
                       <w:r>
-                        <w:t xml:space="preserve"> Case "(Op)zoeken, zien en inzien".</w:t>
+                        <w:fldChar w:fldCharType="separate"/>
+                      </w:r>
+                      <w:r>
+                        <w:rPr>
+                          <w:noProof/>
+                        </w:rPr>
+                        <w:t>2</w:t>
+                      </w:r>
+                      <w:r>
+                        <w:rPr>
+                          <w:noProof/>
+                        </w:rPr>
+                        <w:fldChar w:fldCharType="end"/>
+                      </w:r>
+                      <w:r>
+                        <w:t xml:space="preserve"> Use Case "(Op)zoeken, zien en inzien".</w:t>
                       </w:r>
                       <w:bookmarkEnd w:id="17"/>
                     </w:p>
@@ -10876,10 +10871,10 @@
                                 <w:noProof/>
                               </w:rPr>
                               <w:object w:dxaOrig="11208" w:dyaOrig="6984" w14:anchorId="18426229">
-                                <v:shape id="_x0000_i1034" type="#_x0000_t75" style="width:436.55pt;height:272.4pt">
+                                <v:shape id="_x0000_i1029" type="#_x0000_t75" style="width:436.55pt;height:272.4pt">
                                   <v:imagedata r:id="rId21" o:title=""/>
                                 </v:shape>
-                                <o:OLEObject Type="Embed" ProgID="Visio.Drawing.11" ShapeID="_x0000_i1034" DrawAspect="Content" ObjectID="_1843131327" r:id="rId22"/>
+                                <o:OLEObject Type="Embed" ProgID="Visio.Drawing.11" ShapeID="_x0000_i1029" DrawAspect="Content" ObjectID="_1849866815" r:id="rId22"/>
                               </w:object>
                             </w:r>
                           </w:p>
@@ -10890,24 +10885,29 @@
                             <w:r>
                               <w:t xml:space="preserve">Figuur </w:t>
                             </w:r>
-                            <w:fldSimple w:instr=" SEQ Figuur \* ARABIC ">
-                              <w:r>
-                                <w:rPr>
-                                  <w:noProof/>
-                                </w:rPr>
-                                <w:t>4</w:t>
-                              </w:r>
-                            </w:fldSimple>
                             <w:r>
-                              <w:t xml:space="preserve"> "</w:t>
+                              <w:fldChar w:fldCharType="begin"/>
                             </w:r>
-                            <w:proofErr w:type="spellStart"/>
                             <w:r>
-                              <w:t>Use</w:t>
+                              <w:instrText xml:space="preserve"> SEQ Figuur \* ARABIC </w:instrText>
                             </w:r>
-                            <w:proofErr w:type="spellEnd"/>
                             <w:r>
-                              <w:t xml:space="preserve"> Case Toevoegen</w:t>
+                              <w:fldChar w:fldCharType="separate"/>
+                            </w:r>
+                            <w:r>
+                              <w:rPr>
+                                <w:noProof/>
+                              </w:rPr>
+                              <w:t>4</w:t>
+                            </w:r>
+                            <w:r>
+                              <w:rPr>
+                                <w:noProof/>
+                              </w:rPr>
+                              <w:fldChar w:fldCharType="end"/>
+                            </w:r>
+                            <w:r>
+                              <w:t xml:space="preserve"> "Use Case Toevoegen</w:t>
                             </w:r>
                             <w:r>
                               <w:t xml:space="preserve"> Documenten, Dossiers, Reeksen</w:t>
@@ -10942,10 +10942,10 @@
                           <w:noProof/>
                         </w:rPr>
                         <w:object w:dxaOrig="11208" w:dyaOrig="6984" w14:anchorId="18426229">
-                          <v:shape id="_x0000_i1034" type="#_x0000_t75" style="width:436.55pt;height:272.4pt">
+                          <v:shape id="_x0000_i1029" type="#_x0000_t75" style="width:436.55pt;height:272.4pt">
                             <v:imagedata r:id="rId21" o:title=""/>
                           </v:shape>
-                          <o:OLEObject Type="Embed" ProgID="Visio.Drawing.11" ShapeID="_x0000_i1034" DrawAspect="Content" ObjectID="_1843131327" r:id="rId23"/>
+                          <o:OLEObject Type="Embed" ProgID="Visio.Drawing.11" ShapeID="_x0000_i1029" DrawAspect="Content" ObjectID="_1849866815" r:id="rId23"/>
                         </w:object>
                       </w:r>
                     </w:p>
@@ -10956,24 +10956,29 @@
                       <w:r>
                         <w:t xml:space="preserve">Figuur </w:t>
                       </w:r>
-                      <w:fldSimple w:instr=" SEQ Figuur \* ARABIC ">
-                        <w:r>
-                          <w:rPr>
-                            <w:noProof/>
-                          </w:rPr>
-                          <w:t>4</w:t>
-                        </w:r>
-                      </w:fldSimple>
                       <w:r>
-                        <w:t xml:space="preserve"> "</w:t>
+                        <w:fldChar w:fldCharType="begin"/>
                       </w:r>
-                      <w:proofErr w:type="spellStart"/>
                       <w:r>
-                        <w:t>Use</w:t>
+                        <w:instrText xml:space="preserve"> SEQ Figuur \* ARABIC </w:instrText>
                       </w:r>
-                      <w:proofErr w:type="spellEnd"/>
                       <w:r>
-                        <w:t xml:space="preserve"> Case Toevoegen</w:t>
+                        <w:fldChar w:fldCharType="separate"/>
+                      </w:r>
+                      <w:r>
+                        <w:rPr>
+                          <w:noProof/>
+                        </w:rPr>
+                        <w:t>4</w:t>
+                      </w:r>
+                      <w:r>
+                        <w:rPr>
+                          <w:noProof/>
+                        </w:rPr>
+                        <w:fldChar w:fldCharType="end"/>
+                      </w:r>
+                      <w:r>
+                        <w:t xml:space="preserve"> "Use Case Toevoegen</w:t>
                       </w:r>
                       <w:r>
                         <w:t xml:space="preserve"> Documenten, Dossiers, Reeksen</w:t>
@@ -11061,10 +11066,10 @@
                                 <w:noProof/>
                               </w:rPr>
                               <w:object w:dxaOrig="9095" w:dyaOrig="6984" w14:anchorId="26DBC404">
-                                <v:shape id="_x0000_i1036" type="#_x0000_t75" style="width:353.8pt;height:272.4pt">
+                                <v:shape id="_x0000_i1030" type="#_x0000_t75" style="width:353.8pt;height:272.4pt">
                                   <v:imagedata r:id="rId24" o:title=""/>
                                 </v:shape>
-                                <o:OLEObject Type="Embed" ProgID="Visio.Drawing.11" ShapeID="_x0000_i1036" DrawAspect="Content" ObjectID="_1843131328" r:id="rId25"/>
+                                <o:OLEObject Type="Embed" ProgID="Visio.Drawing.11" ShapeID="_x0000_i1030" DrawAspect="Content" ObjectID="_1849866816" r:id="rId25"/>
                               </w:object>
                             </w:r>
                           </w:p>
@@ -11076,24 +11081,29 @@
                             <w:r>
                               <w:t xml:space="preserve">Figuur </w:t>
                             </w:r>
-                            <w:fldSimple w:instr=" SEQ Figuur \* ARABIC ">
-                              <w:r>
-                                <w:rPr>
-                                  <w:noProof/>
-                                </w:rPr>
-                                <w:t>5</w:t>
-                              </w:r>
-                            </w:fldSimple>
                             <w:r>
-                              <w:t xml:space="preserve"> "</w:t>
+                              <w:fldChar w:fldCharType="begin"/>
                             </w:r>
-                            <w:proofErr w:type="spellStart"/>
                             <w:r>
-                              <w:t>Use</w:t>
+                              <w:instrText xml:space="preserve"> SEQ Figuur \* ARABIC </w:instrText>
                             </w:r>
-                            <w:proofErr w:type="spellEnd"/>
                             <w:r>
-                              <w:t xml:space="preserve"> Case Verwijderen</w:t>
+                              <w:fldChar w:fldCharType="separate"/>
+                            </w:r>
+                            <w:r>
+                              <w:rPr>
+                                <w:noProof/>
+                              </w:rPr>
+                              <w:t>5</w:t>
+                            </w:r>
+                            <w:r>
+                              <w:rPr>
+                                <w:noProof/>
+                              </w:rPr>
+                              <w:fldChar w:fldCharType="end"/>
+                            </w:r>
+                            <w:r>
+                              <w:t xml:space="preserve"> "Use Case Verwijderen</w:t>
                             </w:r>
                             <w:r>
                               <w:t xml:space="preserve"> Documenten, Dossiers, Reeksen</w:t>
@@ -11129,10 +11139,10 @@
                           <w:noProof/>
                         </w:rPr>
                         <w:object w:dxaOrig="9095" w:dyaOrig="6984" w14:anchorId="26DBC404">
-                          <v:shape id="_x0000_i1036" type="#_x0000_t75" style="width:353.8pt;height:272.4pt">
+                          <v:shape id="_x0000_i1030" type="#_x0000_t75" style="width:353.8pt;height:272.4pt">
                             <v:imagedata r:id="rId24" o:title=""/>
                           </v:shape>
-                          <o:OLEObject Type="Embed" ProgID="Visio.Drawing.11" ShapeID="_x0000_i1036" DrawAspect="Content" ObjectID="_1843131328" r:id="rId26"/>
+                          <o:OLEObject Type="Embed" ProgID="Visio.Drawing.11" ShapeID="_x0000_i1030" DrawAspect="Content" ObjectID="_1849866816" r:id="rId26"/>
                         </w:object>
                       </w:r>
                     </w:p>
@@ -11144,24 +11154,29 @@
                       <w:r>
                         <w:t xml:space="preserve">Figuur </w:t>
                       </w:r>
-                      <w:fldSimple w:instr=" SEQ Figuur \* ARABIC ">
-                        <w:r>
-                          <w:rPr>
-                            <w:noProof/>
-                          </w:rPr>
-                          <w:t>5</w:t>
-                        </w:r>
-                      </w:fldSimple>
                       <w:r>
-                        <w:t xml:space="preserve"> "</w:t>
+                        <w:fldChar w:fldCharType="begin"/>
                       </w:r>
-                      <w:proofErr w:type="spellStart"/>
                       <w:r>
-                        <w:t>Use</w:t>
+                        <w:instrText xml:space="preserve"> SEQ Figuur \* ARABIC </w:instrText>
                       </w:r>
-                      <w:proofErr w:type="spellEnd"/>
                       <w:r>
-                        <w:t xml:space="preserve"> Case Verwijderen</w:t>
+                        <w:fldChar w:fldCharType="separate"/>
+                      </w:r>
+                      <w:r>
+                        <w:rPr>
+                          <w:noProof/>
+                        </w:rPr>
+                        <w:t>5</w:t>
+                      </w:r>
+                      <w:r>
+                        <w:rPr>
+                          <w:noProof/>
+                        </w:rPr>
+                        <w:fldChar w:fldCharType="end"/>
+                      </w:r>
+                      <w:r>
+                        <w:t xml:space="preserve"> "Use Case Verwijderen</w:t>
                       </w:r>
                       <w:r>
                         <w:t xml:space="preserve"> Documenten, Dossiers, Reeksen</w:t>
@@ -11663,15 +11678,7 @@
         <w:t>5</w:t>
       </w:r>
       <w:r>
-        <w:t xml:space="preserve"> "</w:t>
-      </w:r>
-      <w:proofErr w:type="spellStart"/>
-      <w:r>
-        <w:t>Use</w:t>
-      </w:r>
-      <w:proofErr w:type="spellEnd"/>
-      <w:r>
-        <w:t xml:space="preserve"> Case Verwijderen Documenten, Dossiers, Reeksen"</w:t>
+        <w:t xml:space="preserve"> "Use Case Verwijderen Documenten, Dossiers, Reeksen"</w:t>
       </w:r>
       <w:r>
         <w:rPr>
@@ -11745,29 +11752,7 @@
           <w:szCs w:val="22"/>
           <w14:ligatures w14:val="none"/>
         </w:rPr>
-        <w:t xml:space="preserve">Een NB (Nader bepalen) of Tb (Tijdelijk bewaren) Document waarvan de looptijd verstreken is, komt in de lijst. Het Document kan verwijderd worden of de Waardering </w:t>
-      </w:r>
-      <w:proofErr w:type="spellStart"/>
-      <w:r>
-        <w:rPr>
-          <w:rFonts w:ascii="Calibri" w:eastAsia="Calibri" w:hAnsi="Calibri" w:cs="Times New Roman"/>
-          <w:kern w:val="0"/>
-          <w:sz w:val="22"/>
-          <w:szCs w:val="22"/>
-          <w14:ligatures w14:val="none"/>
-        </w:rPr>
-        <w:t>Bb</w:t>
-      </w:r>
-      <w:proofErr w:type="spellEnd"/>
-      <w:r>
-        <w:rPr>
-          <w:rFonts w:ascii="Calibri" w:eastAsia="Calibri" w:hAnsi="Calibri" w:cs="Times New Roman"/>
-          <w:kern w:val="0"/>
-          <w:sz w:val="22"/>
-          <w:szCs w:val="22"/>
-          <w14:ligatures w14:val="none"/>
-        </w:rPr>
-        <w:t xml:space="preserve"> (Blijvend bewaren</w:t>
+        <w:t>Een NB (Nader bepalen) of Tb (Tijdelijk bewaren) Document waarvan de looptijd verstreken is, komt in de lijst. Het Document kan verwijderd worden of de Waardering Bb (Blijvend bewaren</w:t>
       </w:r>
       <w:r>
         <w:rPr>
@@ -12782,39 +12767,17 @@
           <w:szCs w:val="22"/>
           <w14:ligatures w14:val="none"/>
         </w:rPr>
-        <w:t xml:space="preserve">Decor </w:t>
-      </w:r>
-      <w:proofErr w:type="spellStart"/>
-      <w:r>
-        <w:rPr>
-          <w:rFonts w:ascii="Calibri" w:eastAsia="Calibri" w:hAnsi="Calibri" w:cs="Times New Roman"/>
-          <w:kern w:val="0"/>
-          <w:sz w:val="22"/>
-          <w:szCs w:val="22"/>
-          <w14:ligatures w14:val="none"/>
-        </w:rPr>
-        <w:t>L</w:t>
-      </w:r>
-      <w:r>
-        <w:rPr>
-          <w:rFonts w:ascii="Calibri" w:eastAsia="Calibri" w:hAnsi="Calibri" w:cs="Times New Roman"/>
-          <w:kern w:val="0"/>
-          <w:sz w:val="22"/>
-          <w:szCs w:val="22"/>
-          <w14:ligatures w14:val="none"/>
-        </w:rPr>
-        <w:t>jsten</w:t>
-      </w:r>
-      <w:proofErr w:type="spellEnd"/>
-      <w:r>
-        <w:rPr>
-          <w:rFonts w:ascii="Calibri" w:eastAsia="Calibri" w:hAnsi="Calibri" w:cs="Times New Roman"/>
-          <w:kern w:val="0"/>
-          <w:sz w:val="22"/>
-          <w:szCs w:val="22"/>
-          <w14:ligatures w14:val="none"/>
-        </w:rPr>
-        <w:t xml:space="preserve"> (zie “</w:t>
+        <w:t>Decor L</w:t>
+      </w:r>
+      <w:r>
+        <w:rPr>
+          <w:rFonts w:ascii="Calibri" w:eastAsia="Calibri" w:hAnsi="Calibri" w:cs="Times New Roman"/>
+          <w:kern w:val="0"/>
+          <w:sz w:val="22"/>
+          <w:szCs w:val="22"/>
+          <w14:ligatures w14:val="none"/>
+        </w:rPr>
+        <w:t>jsten (zie “</w:t>
       </w:r>
       <w:r>
         <w:rPr>
@@ -13029,10 +12992,10 @@
                                 <w:noProof/>
                               </w:rPr>
                               <w:object w:dxaOrig="9168" w:dyaOrig="6984" w14:anchorId="0EB78E8C">
-                                <v:shape id="_x0000_i1038" type="#_x0000_t75" style="width:357.1pt;height:272.4pt">
+                                <v:shape id="_x0000_i1031" type="#_x0000_t75" style="width:357.1pt;height:272.4pt">
                                   <v:imagedata r:id="rId27" o:title=""/>
                                 </v:shape>
-                                <o:OLEObject Type="Embed" ProgID="Visio.Drawing.11" ShapeID="_x0000_i1038" DrawAspect="Content" ObjectID="_1843131329" r:id="rId28"/>
+                                <o:OLEObject Type="Embed" ProgID="Visio.Drawing.11" ShapeID="_x0000_i1031" DrawAspect="Content" ObjectID="_1849866817" r:id="rId28"/>
                               </w:object>
                             </w:r>
                           </w:p>
@@ -13043,24 +13006,29 @@
                             <w:r>
                               <w:t xml:space="preserve">Figuur </w:t>
                             </w:r>
-                            <w:fldSimple w:instr=" SEQ Figuur \* ARABIC ">
-                              <w:r>
-                                <w:rPr>
-                                  <w:noProof/>
-                                </w:rPr>
-                                <w:t>5</w:t>
-                              </w:r>
-                            </w:fldSimple>
                             <w:r>
-                              <w:t xml:space="preserve"> "</w:t>
+                              <w:fldChar w:fldCharType="begin"/>
                             </w:r>
-                            <w:proofErr w:type="spellStart"/>
                             <w:r>
-                              <w:t>Use</w:t>
+                              <w:instrText xml:space="preserve"> SEQ Figuur \* ARABIC </w:instrText>
                             </w:r>
-                            <w:proofErr w:type="spellEnd"/>
                             <w:r>
-                              <w:t xml:space="preserve"> Case Beheren"</w:t>
+                              <w:fldChar w:fldCharType="separate"/>
+                            </w:r>
+                            <w:r>
+                              <w:rPr>
+                                <w:noProof/>
+                              </w:rPr>
+                              <w:t>5</w:t>
+                            </w:r>
+                            <w:r>
+                              <w:rPr>
+                                <w:noProof/>
+                              </w:rPr>
+                              <w:fldChar w:fldCharType="end"/>
+                            </w:r>
+                            <w:r>
+                              <w:t xml:space="preserve"> "Use Case Beheren"</w:t>
                             </w:r>
                           </w:p>
                           <w:p/>
@@ -13095,10 +13063,10 @@
                           <w:noProof/>
                         </w:rPr>
                         <w:object w:dxaOrig="9168" w:dyaOrig="6984" w14:anchorId="0EB78E8C">
-                          <v:shape id="_x0000_i1038" type="#_x0000_t75" style="width:357.1pt;height:272.4pt">
+                          <v:shape id="_x0000_i1031" type="#_x0000_t75" style="width:357.1pt;height:272.4pt">
                             <v:imagedata r:id="rId27" o:title=""/>
                           </v:shape>
-                          <o:OLEObject Type="Embed" ProgID="Visio.Drawing.11" ShapeID="_x0000_i1038" DrawAspect="Content" ObjectID="_1843131329" r:id="rId29"/>
+                          <o:OLEObject Type="Embed" ProgID="Visio.Drawing.11" ShapeID="_x0000_i1031" DrawAspect="Content" ObjectID="_1849866817" r:id="rId29"/>
                         </w:object>
                       </w:r>
                     </w:p>
@@ -13109,24 +13077,29 @@
                       <w:r>
                         <w:t xml:space="preserve">Figuur </w:t>
                       </w:r>
-                      <w:fldSimple w:instr=" SEQ Figuur \* ARABIC ">
-                        <w:r>
-                          <w:rPr>
-                            <w:noProof/>
-                          </w:rPr>
-                          <w:t>5</w:t>
-                        </w:r>
-                      </w:fldSimple>
                       <w:r>
-                        <w:t xml:space="preserve"> "</w:t>
+                        <w:fldChar w:fldCharType="begin"/>
                       </w:r>
-                      <w:proofErr w:type="spellStart"/>
                       <w:r>
-                        <w:t>Use</w:t>
+                        <w:instrText xml:space="preserve"> SEQ Figuur \* ARABIC </w:instrText>
                       </w:r>
-                      <w:proofErr w:type="spellEnd"/>
                       <w:r>
-                        <w:t xml:space="preserve"> Case Beheren"</w:t>
+                        <w:fldChar w:fldCharType="separate"/>
+                      </w:r>
+                      <w:r>
+                        <w:rPr>
+                          <w:noProof/>
+                        </w:rPr>
+                        <w:t>5</w:t>
+                      </w:r>
+                      <w:r>
+                        <w:rPr>
+                          <w:noProof/>
+                        </w:rPr>
+                        <w:fldChar w:fldCharType="end"/>
+                      </w:r>
+                      <w:r>
+                        <w:t xml:space="preserve"> "Use Case Beheren"</w:t>
                       </w:r>
                     </w:p>
                     <w:p/>
@@ -13852,10 +13825,10 @@
                                 <w:noProof/>
                               </w:rPr>
                               <w:object w:dxaOrig="8052" w:dyaOrig="3996" w14:anchorId="031855B7">
-                                <v:shape id="_x0000_i1040" type="#_x0000_t75" style="width:313.65pt;height:156.05pt">
+                                <v:shape id="_x0000_i1032" type="#_x0000_t75" style="width:313.65pt;height:156.05pt">
                                   <v:imagedata r:id="rId30" o:title=""/>
                                 </v:shape>
-                                <o:OLEObject Type="Embed" ProgID="Visio.Drawing.11" ShapeID="_x0000_i1040" DrawAspect="Content" ObjectID="_1843131330" r:id="rId31"/>
+                                <o:OLEObject Type="Embed" ProgID="Visio.Drawing.11" ShapeID="_x0000_i1032" DrawAspect="Content" ObjectID="_1849866818" r:id="rId31"/>
                               </w:object>
                             </w:r>
                           </w:p>
@@ -13866,24 +13839,29 @@
                             <w:r>
                               <w:t xml:space="preserve">Figuur </w:t>
                             </w:r>
-                            <w:fldSimple w:instr=" SEQ Figuur \* ARABIC ">
-                              <w:r>
-                                <w:rPr>
-                                  <w:noProof/>
-                                </w:rPr>
-                                <w:t>5</w:t>
-                              </w:r>
-                            </w:fldSimple>
                             <w:r>
-                              <w:t xml:space="preserve"> "</w:t>
+                              <w:fldChar w:fldCharType="begin"/>
                             </w:r>
-                            <w:proofErr w:type="spellStart"/>
                             <w:r>
-                              <w:t>Use</w:t>
+                              <w:instrText xml:space="preserve"> SEQ Figuur \* ARABIC </w:instrText>
                             </w:r>
-                            <w:proofErr w:type="spellEnd"/>
                             <w:r>
-                              <w:t xml:space="preserve"> Case Beheren"</w:t>
+                              <w:fldChar w:fldCharType="separate"/>
+                            </w:r>
+                            <w:r>
+                              <w:rPr>
+                                <w:noProof/>
+                              </w:rPr>
+                              <w:t>5</w:t>
+                            </w:r>
+                            <w:r>
+                              <w:rPr>
+                                <w:noProof/>
+                              </w:rPr>
+                              <w:fldChar w:fldCharType="end"/>
+                            </w:r>
+                            <w:r>
+                              <w:t xml:space="preserve"> "Use Case Beheren"</w:t>
                             </w:r>
                           </w:p>
                           <w:p/>
@@ -13912,10 +13890,10 @@
                           <w:noProof/>
                         </w:rPr>
                         <w:object w:dxaOrig="8052" w:dyaOrig="3996" w14:anchorId="031855B7">
-                          <v:shape id="_x0000_i1040" type="#_x0000_t75" style="width:313.65pt;height:156.05pt">
+                          <v:shape id="_x0000_i1032" type="#_x0000_t75" style="width:313.65pt;height:156.05pt">
                             <v:imagedata r:id="rId30" o:title=""/>
                           </v:shape>
-                          <o:OLEObject Type="Embed" ProgID="Visio.Drawing.11" ShapeID="_x0000_i1040" DrawAspect="Content" ObjectID="_1843131330" r:id="rId32"/>
+                          <o:OLEObject Type="Embed" ProgID="Visio.Drawing.11" ShapeID="_x0000_i1032" DrawAspect="Content" ObjectID="_1849866818" r:id="rId32"/>
                         </w:object>
                       </w:r>
                     </w:p>
@@ -13926,24 +13904,29 @@
                       <w:r>
                         <w:t xml:space="preserve">Figuur </w:t>
                       </w:r>
-                      <w:fldSimple w:instr=" SEQ Figuur \* ARABIC ">
-                        <w:r>
-                          <w:rPr>
-                            <w:noProof/>
-                          </w:rPr>
-                          <w:t>5</w:t>
-                        </w:r>
-                      </w:fldSimple>
                       <w:r>
-                        <w:t xml:space="preserve"> "</w:t>
+                        <w:fldChar w:fldCharType="begin"/>
                       </w:r>
-                      <w:proofErr w:type="spellStart"/>
                       <w:r>
-                        <w:t>Use</w:t>
+                        <w:instrText xml:space="preserve"> SEQ Figuur \* ARABIC </w:instrText>
                       </w:r>
-                      <w:proofErr w:type="spellEnd"/>
                       <w:r>
-                        <w:t xml:space="preserve"> Case Beheren"</w:t>
+                        <w:fldChar w:fldCharType="separate"/>
+                      </w:r>
+                      <w:r>
+                        <w:rPr>
+                          <w:noProof/>
+                        </w:rPr>
+                        <w:t>5</w:t>
+                      </w:r>
+                      <w:r>
+                        <w:rPr>
+                          <w:noProof/>
+                        </w:rPr>
+                        <w:fldChar w:fldCharType="end"/>
+                      </w:r>
+                      <w:r>
+                        <w:t xml:space="preserve"> "Use Case Beheren"</w:t>
                       </w:r>
                     </w:p>
                     <w:p/>
@@ -14285,7 +14268,50 @@
           <w:szCs w:val="22"/>
           <w14:ligatures w14:val="none"/>
         </w:rPr>
-        <w:t xml:space="preserve"> betreft klussen die gedaan moeten worden, niet zijnde Redderen. </w:t>
+        <w:t xml:space="preserve"> betreft</w:t>
+      </w:r>
+      <w:r>
+        <w:t xml:space="preserve"> </w:t>
+      </w:r>
+      <w:r>
+        <w:rPr>
+          <w:rFonts w:ascii="Calibri" w:eastAsia="Calibri" w:hAnsi="Calibri" w:cs="Times New Roman"/>
+          <w:kern w:val="0"/>
+          <w:sz w:val="22"/>
+          <w:szCs w:val="22"/>
+          <w14:ligatures w14:val="none"/>
+        </w:rPr>
+        <w:t>iets in goede staat houden</w:t>
+      </w:r>
+      <w:r>
+        <w:rPr>
+          <w:rFonts w:ascii="Calibri" w:eastAsia="Calibri" w:hAnsi="Calibri" w:cs="Times New Roman"/>
+          <w:kern w:val="0"/>
+          <w:sz w:val="22"/>
+          <w:szCs w:val="22"/>
+          <w14:ligatures w14:val="none"/>
+        </w:rPr>
+        <w:t xml:space="preserve"> </w:t>
+      </w:r>
+      <w:r>
+        <w:rPr>
+          <w:rFonts w:ascii="Calibri" w:eastAsia="Calibri" w:hAnsi="Calibri" w:cs="Times New Roman"/>
+          <w:kern w:val="0"/>
+          <w:sz w:val="22"/>
+          <w:szCs w:val="22"/>
+          <w14:ligatures w14:val="none"/>
+        </w:rPr>
+        <w:t>en zo nodig repareren.</w:t>
+      </w:r>
+      <w:r>
+        <w:rPr>
+          <w:rFonts w:ascii="Calibri" w:eastAsia="Calibri" w:hAnsi="Calibri" w:cs="Times New Roman"/>
+          <w:kern w:val="0"/>
+          <w:sz w:val="22"/>
+          <w:szCs w:val="22"/>
+          <w14:ligatures w14:val="none"/>
+        </w:rPr>
+        <w:t xml:space="preserve"> Redderen. </w:t>
       </w:r>
       <w:r>
         <w:rPr>
@@ -14327,7 +14353,27 @@
           <w:szCs w:val="22"/>
           <w14:ligatures w14:val="none"/>
         </w:rPr>
-        <w:t xml:space="preserve"> het vastleggen van wat er is gebeurd.</w:t>
+        <w:t xml:space="preserve"> het vastleggen van wat er is gebeurd</w:t>
+      </w:r>
+      <w:r>
+        <w:rPr>
+          <w:rFonts w:ascii="Calibri" w:eastAsia="Calibri" w:hAnsi="Calibri" w:cs="Times New Roman"/>
+          <w:kern w:val="0"/>
+          <w:sz w:val="22"/>
+          <w:szCs w:val="22"/>
+          <w14:ligatures w14:val="none"/>
+        </w:rPr>
+        <w:t>, althans voor de belangrijke zaken</w:t>
+      </w:r>
+      <w:r>
+        <w:rPr>
+          <w:rFonts w:ascii="Calibri" w:eastAsia="Calibri" w:hAnsi="Calibri" w:cs="Times New Roman"/>
+          <w:kern w:val="0"/>
+          <w:sz w:val="22"/>
+          <w:szCs w:val="22"/>
+          <w14:ligatures w14:val="none"/>
+        </w:rPr>
+        <w:t>.</w:t>
       </w:r>
       <w:r>
         <w:rPr>
@@ -14782,10 +14828,10 @@
                                 <w:szCs w:val="22"/>
                               </w:rPr>
                               <w:object w:dxaOrig="5892" w:dyaOrig="5076" w14:anchorId="6C1C88FE">
-                                <v:shape id="_x0000_i1042" type="#_x0000_t75" style="width:262.5pt;height:225.65pt">
+                                <v:shape id="_x0000_i1033" type="#_x0000_t75" style="width:262.5pt;height:225.65pt">
                                   <v:imagedata r:id="rId33" o:title=""/>
                                 </v:shape>
-                                <o:OLEObject Type="Embed" ProgID="Visio.Drawing.11" ShapeID="_x0000_i1042" DrawAspect="Content" ObjectID="_1843131331" r:id="rId34"/>
+                                <o:OLEObject Type="Embed" ProgID="Visio.Drawing.11" ShapeID="_x0000_i1033" DrawAspect="Content" ObjectID="_1849866819" r:id="rId34"/>
                               </w:object>
                             </w:r>
                           </w:p>
@@ -14796,14 +14842,27 @@
                             <w:r>
                               <w:t xml:space="preserve">Figuur </w:t>
                             </w:r>
-                            <w:fldSimple w:instr=" SEQ Figuur \* ARABIC ">
-                              <w:r>
-                                <w:rPr>
-                                  <w:noProof/>
-                                </w:rPr>
-                                <w:t>7</w:t>
-                              </w:r>
-                            </w:fldSimple>
+                            <w:r>
+                              <w:fldChar w:fldCharType="begin"/>
+                            </w:r>
+                            <w:r>
+                              <w:instrText xml:space="preserve"> SEQ Figuur \* ARABIC </w:instrText>
+                            </w:r>
+                            <w:r>
+                              <w:fldChar w:fldCharType="separate"/>
+                            </w:r>
+                            <w:r>
+                              <w:rPr>
+                                <w:noProof/>
+                              </w:rPr>
+                              <w:t>7</w:t>
+                            </w:r>
+                            <w:r>
+                              <w:rPr>
+                                <w:noProof/>
+                              </w:rPr>
+                              <w:fldChar w:fldCharType="end"/>
+                            </w:r>
                             <w:r>
                               <w:t xml:space="preserve"> Datamodel archief</w:t>
                             </w:r>
@@ -14845,10 +14904,10 @@
                           <w:szCs w:val="22"/>
                         </w:rPr>
                         <w:object w:dxaOrig="5892" w:dyaOrig="5076" w14:anchorId="6C1C88FE">
-                          <v:shape id="_x0000_i1042" type="#_x0000_t75" style="width:262.5pt;height:225.65pt">
+                          <v:shape id="_x0000_i1033" type="#_x0000_t75" style="width:262.5pt;height:225.65pt">
                             <v:imagedata r:id="rId33" o:title=""/>
                           </v:shape>
-                          <o:OLEObject Type="Embed" ProgID="Visio.Drawing.11" ShapeID="_x0000_i1042" DrawAspect="Content" ObjectID="_1843131331" r:id="rId35"/>
+                          <o:OLEObject Type="Embed" ProgID="Visio.Drawing.11" ShapeID="_x0000_i1033" DrawAspect="Content" ObjectID="_1849866819" r:id="rId35"/>
                         </w:object>
                       </w:r>
                     </w:p>
@@ -14859,14 +14918,27 @@
                       <w:r>
                         <w:t xml:space="preserve">Figuur </w:t>
                       </w:r>
-                      <w:fldSimple w:instr=" SEQ Figuur \* ARABIC ">
-                        <w:r>
-                          <w:rPr>
-                            <w:noProof/>
-                          </w:rPr>
-                          <w:t>7</w:t>
-                        </w:r>
-                      </w:fldSimple>
+                      <w:r>
+                        <w:fldChar w:fldCharType="begin"/>
+                      </w:r>
+                      <w:r>
+                        <w:instrText xml:space="preserve"> SEQ Figuur \* ARABIC </w:instrText>
+                      </w:r>
+                      <w:r>
+                        <w:fldChar w:fldCharType="separate"/>
+                      </w:r>
+                      <w:r>
+                        <w:rPr>
+                          <w:noProof/>
+                        </w:rPr>
+                        <w:t>7</w:t>
+                      </w:r>
+                      <w:r>
+                        <w:rPr>
+                          <w:noProof/>
+                        </w:rPr>
+                        <w:fldChar w:fldCharType="end"/>
+                      </w:r>
                       <w:r>
                         <w:t xml:space="preserve"> Datamodel archief</w:t>
                       </w:r>
@@ -15701,7 +15773,6 @@
                 <w:rFonts w:ascii="Calibri" w:eastAsia="Calibri" w:hAnsi="Calibri" w:cs="Times New Roman"/>
               </w:rPr>
             </w:pPr>
-            <w:proofErr w:type="spellStart"/>
             <w:r>
               <w:rPr>
                 <w:rFonts w:ascii="Calibri" w:eastAsia="Calibri" w:hAnsi="Calibri" w:cs="Times New Roman"/>
@@ -15714,7 +15785,6 @@
               </w:rPr>
               <w:t>.A</w:t>
             </w:r>
-            <w:proofErr w:type="spellEnd"/>
           </w:p>
         </w:tc>
         <w:tc>
@@ -15816,7 +15886,6 @@
                 <w:rFonts w:ascii="Calibri" w:eastAsia="Calibri" w:hAnsi="Calibri" w:cs="Times New Roman"/>
               </w:rPr>
             </w:pPr>
-            <w:proofErr w:type="spellStart"/>
             <w:r>
               <w:rPr>
                 <w:rFonts w:ascii="Calibri" w:eastAsia="Calibri" w:hAnsi="Calibri" w:cs="Times New Roman"/>
@@ -15829,7 +15898,6 @@
               </w:rPr>
               <w:t>.B</w:t>
             </w:r>
-            <w:proofErr w:type="spellEnd"/>
           </w:p>
         </w:tc>
         <w:tc>
@@ -15919,7 +15987,6 @@
                 <w:rFonts w:ascii="Calibri" w:eastAsia="Calibri" w:hAnsi="Calibri" w:cs="Times New Roman"/>
               </w:rPr>
             </w:pPr>
-            <w:proofErr w:type="spellStart"/>
             <w:r>
               <w:rPr>
                 <w:rFonts w:ascii="Calibri" w:eastAsia="Calibri" w:hAnsi="Calibri" w:cs="Times New Roman"/>
@@ -15932,7 +15999,6 @@
               </w:rPr>
               <w:t>.C</w:t>
             </w:r>
-            <w:proofErr w:type="spellEnd"/>
           </w:p>
         </w:tc>
         <w:tc>
@@ -16073,7 +16139,6 @@
                 <w:rFonts w:ascii="Calibri" w:eastAsia="Calibri" w:hAnsi="Calibri" w:cs="Times New Roman"/>
               </w:rPr>
             </w:pPr>
-            <w:proofErr w:type="spellStart"/>
             <w:r>
               <w:rPr>
                 <w:rFonts w:ascii="Calibri" w:eastAsia="Calibri" w:hAnsi="Calibri" w:cs="Times New Roman"/>
@@ -16086,7 +16151,6 @@
               </w:rPr>
               <w:t>.D</w:t>
             </w:r>
-            <w:proofErr w:type="spellEnd"/>
           </w:p>
         </w:tc>
         <w:tc>
@@ -16203,7 +16267,6 @@
                 <w:rFonts w:ascii="Calibri" w:eastAsia="Calibri" w:hAnsi="Calibri" w:cs="Times New Roman"/>
               </w:rPr>
             </w:pPr>
-            <w:proofErr w:type="spellStart"/>
             <w:r>
               <w:rPr>
                 <w:rFonts w:ascii="Calibri" w:eastAsia="Calibri" w:hAnsi="Calibri" w:cs="Times New Roman"/>
@@ -16216,7 +16279,6 @@
               </w:rPr>
               <w:t>.E</w:t>
             </w:r>
-            <w:proofErr w:type="spellEnd"/>
           </w:p>
         </w:tc>
         <w:tc>
@@ -16300,7 +16362,6 @@
                 <w:rFonts w:ascii="Calibri" w:eastAsia="Calibri" w:hAnsi="Calibri" w:cs="Times New Roman"/>
               </w:rPr>
             </w:pPr>
-            <w:proofErr w:type="spellStart"/>
             <w:r>
               <w:rPr>
                 <w:rFonts w:ascii="Calibri" w:eastAsia="Calibri" w:hAnsi="Calibri" w:cs="Times New Roman"/>
@@ -16313,7 +16374,6 @@
               </w:rPr>
               <w:t>.F</w:t>
             </w:r>
-            <w:proofErr w:type="spellEnd"/>
           </w:p>
         </w:tc>
         <w:tc>
@@ -16391,7 +16451,6 @@
                 <w:rFonts w:ascii="Calibri" w:eastAsia="Calibri" w:hAnsi="Calibri" w:cs="Times New Roman"/>
               </w:rPr>
             </w:pPr>
-            <w:proofErr w:type="spellStart"/>
             <w:r>
               <w:rPr>
                 <w:rFonts w:ascii="Calibri" w:eastAsia="Calibri" w:hAnsi="Calibri" w:cs="Times New Roman"/>
@@ -16404,7 +16463,6 @@
               </w:rPr>
               <w:t>.G</w:t>
             </w:r>
-            <w:proofErr w:type="spellEnd"/>
           </w:p>
         </w:tc>
         <w:tc>
@@ -17014,14 +17072,12 @@
                 <w:rFonts w:ascii="Calibri" w:eastAsia="Calibri" w:hAnsi="Calibri" w:cs="Times New Roman"/>
               </w:rPr>
             </w:pPr>
-            <w:proofErr w:type="spellStart"/>
             <w:r>
               <w:rPr>
                 <w:rFonts w:ascii="Calibri" w:eastAsia="Calibri" w:hAnsi="Calibri" w:cs="Times New Roman"/>
               </w:rPr>
               <w:t>DekkingInTijd</w:t>
             </w:r>
-            <w:proofErr w:type="spellEnd"/>
           </w:p>
         </w:tc>
         <w:tc>
@@ -17105,14 +17161,12 @@
                 <w:rFonts w:ascii="Calibri" w:eastAsia="Calibri" w:hAnsi="Calibri" w:cs="Times New Roman"/>
               </w:rPr>
             </w:pPr>
-            <w:proofErr w:type="spellStart"/>
             <w:r>
               <w:rPr>
                 <w:rFonts w:ascii="Calibri" w:eastAsia="Calibri" w:hAnsi="Calibri" w:cs="Times New Roman"/>
               </w:rPr>
               <w:t>DekkingInOnderwerp</w:t>
             </w:r>
-            <w:proofErr w:type="spellEnd"/>
           </w:p>
         </w:tc>
         <w:tc>
@@ -17157,27 +17211,31 @@
               <w:rPr>
                 <w:rFonts w:ascii="Calibri" w:eastAsia="Calibri" w:hAnsi="Calibri" w:cs="Times New Roman"/>
               </w:rPr>
-              <w:t xml:space="preserve">Het onderwerp zou onder een algemene noemer geplaats kunnen worden. Denk aan “apparaat” voor computer, cv, etc. Als dat zo is dan is </w:t>
-            </w:r>
-            <w:proofErr w:type="spellStart"/>
-            <w:r>
-              <w:rPr>
-                <w:rFonts w:ascii="Calibri" w:eastAsia="Calibri" w:hAnsi="Calibri" w:cs="Times New Roman"/>
-              </w:rPr>
-              <w:t>D</w:t>
-            </w:r>
-            <w:r>
-              <w:rPr>
-                <w:rFonts w:ascii="Calibri" w:eastAsia="Calibri" w:hAnsi="Calibri" w:cs="Times New Roman"/>
-              </w:rPr>
-              <w:t>ekkingInOnderwerp</w:t>
-            </w:r>
-            <w:proofErr w:type="spellEnd"/>
-            <w:r>
-              <w:rPr>
-                <w:rFonts w:ascii="Calibri" w:eastAsia="Calibri" w:hAnsi="Calibri" w:cs="Times New Roman"/>
-              </w:rPr>
-              <w:t xml:space="preserve"> die noemer.</w:t>
+              <w:t xml:space="preserve">Het onderwerp zou </w:t>
+            </w:r>
+            <w:r>
+              <w:rPr>
+                <w:rFonts w:ascii="Calibri" w:eastAsia="Calibri" w:hAnsi="Calibri" w:cs="Times New Roman"/>
+              </w:rPr>
+              <w:t xml:space="preserve">wordt </w:t>
+            </w:r>
+            <w:r>
+              <w:rPr>
+                <w:rFonts w:ascii="Calibri" w:eastAsia="Calibri" w:hAnsi="Calibri" w:cs="Times New Roman"/>
+              </w:rPr>
+              <w:t>onder een algemene noemer geplaats</w:t>
+            </w:r>
+            <w:r>
+              <w:rPr>
+                <w:rFonts w:ascii="Calibri" w:eastAsia="Calibri" w:hAnsi="Calibri" w:cs="Times New Roman"/>
+              </w:rPr>
+              <w:t>t</w:t>
+            </w:r>
+            <w:r>
+              <w:rPr>
+                <w:rFonts w:ascii="Calibri" w:eastAsia="Calibri" w:hAnsi="Calibri" w:cs="Times New Roman"/>
+              </w:rPr>
+              <w:t>. Denk aan “apparaat” voor computer, cv, etc.</w:t>
             </w:r>
           </w:p>
         </w:tc>
@@ -17360,16 +17418,8 @@
               <w:rPr>
                 <w:rFonts w:ascii="Calibri" w:eastAsia="Calibri" w:hAnsi="Calibri" w:cs="Times New Roman"/>
               </w:rPr>
-              <w:t xml:space="preserve">. Standard: </w:t>
-            </w:r>
-            <w:proofErr w:type="spellStart"/>
-            <w:r>
-              <w:rPr>
-                <w:rFonts w:ascii="Calibri" w:eastAsia="Calibri" w:hAnsi="Calibri" w:cs="Times New Roman"/>
-              </w:rPr>
-              <w:t>Bb</w:t>
-            </w:r>
-            <w:proofErr w:type="spellEnd"/>
+              <w:t>. Standard: Bb</w:t>
+            </w:r>
           </w:p>
         </w:tc>
       </w:tr>
@@ -17389,14 +17439,12 @@
                 <w:rFonts w:ascii="Calibri" w:eastAsia="Calibri" w:hAnsi="Calibri" w:cs="Times New Roman"/>
               </w:rPr>
             </w:pPr>
-            <w:proofErr w:type="spellStart"/>
             <w:r>
               <w:rPr>
                 <w:rFonts w:ascii="Calibri" w:eastAsia="Calibri" w:hAnsi="Calibri" w:cs="Times New Roman"/>
               </w:rPr>
               <w:t>BewaartermijnEind</w:t>
             </w:r>
-            <w:proofErr w:type="spellEnd"/>
           </w:p>
         </w:tc>
         <w:tc>
@@ -17480,14 +17528,12 @@
                 <w:rFonts w:ascii="Calibri" w:eastAsia="Calibri" w:hAnsi="Calibri" w:cs="Times New Roman"/>
               </w:rPr>
             </w:pPr>
-            <w:proofErr w:type="spellStart"/>
             <w:r>
               <w:rPr>
                 <w:rFonts w:ascii="Calibri" w:eastAsia="Calibri" w:hAnsi="Calibri" w:cs="Times New Roman"/>
               </w:rPr>
               <w:t>BeperkingInGebruik</w:t>
             </w:r>
-            <w:proofErr w:type="spellEnd"/>
           </w:p>
         </w:tc>
         <w:tc>
@@ -17528,14 +17574,12 @@
               </w:rPr>
               <w:t xml:space="preserve">Indicator voor toegang tot het  Document. Zie </w:t>
             </w:r>
-            <w:proofErr w:type="spellStart"/>
             <w:r>
               <w:rPr>
                 <w:rFonts w:ascii="Calibri" w:eastAsia="Calibri" w:hAnsi="Calibri" w:cs="Times New Roman"/>
               </w:rPr>
               <w:t>BeperkingInGebruik</w:t>
             </w:r>
-            <w:proofErr w:type="spellEnd"/>
             <w:r>
               <w:rPr>
                 <w:rFonts w:ascii="Calibri" w:eastAsia="Calibri" w:hAnsi="Calibri" w:cs="Times New Roman"/>
@@ -17615,14 +17659,12 @@
                 <w:rFonts w:ascii="Calibri" w:eastAsia="Calibri" w:hAnsi="Calibri" w:cs="Times New Roman"/>
               </w:rPr>
             </w:pPr>
-            <w:proofErr w:type="spellStart"/>
             <w:r>
               <w:rPr>
                 <w:rFonts w:ascii="Calibri" w:eastAsia="Calibri" w:hAnsi="Calibri" w:cs="Times New Roman"/>
               </w:rPr>
               <w:t>VerwijderIndicator</w:t>
             </w:r>
-            <w:proofErr w:type="spellEnd"/>
           </w:p>
         </w:tc>
         <w:tc>
@@ -17637,14 +17679,12 @@
                 <w:rFonts w:ascii="Calibri" w:eastAsia="Calibri" w:hAnsi="Calibri" w:cs="Times New Roman"/>
               </w:rPr>
             </w:pPr>
-            <w:proofErr w:type="spellStart"/>
             <w:r>
               <w:rPr>
                 <w:rFonts w:ascii="Calibri" w:eastAsia="Calibri" w:hAnsi="Calibri" w:cs="Times New Roman"/>
               </w:rPr>
               <w:t>Boolean</w:t>
             </w:r>
-            <w:proofErr w:type="spellEnd"/>
           </w:p>
         </w:tc>
         <w:tc>
@@ -17663,21 +17703,7 @@
               <w:rPr>
                 <w:rFonts w:ascii="Calibri" w:eastAsia="Calibri" w:hAnsi="Calibri" w:cs="Times New Roman"/>
               </w:rPr>
-              <w:t xml:space="preserve">Indicator die aangeeft dat een Document uit het Archief verwijderd kan worden. Bijvoorbeeld om dat de </w:t>
-            </w:r>
-            <w:proofErr w:type="spellStart"/>
-            <w:r>
-              <w:rPr>
-                <w:rFonts w:ascii="Calibri" w:eastAsia="Calibri" w:hAnsi="Calibri" w:cs="Times New Roman"/>
-              </w:rPr>
-              <w:t>BewaartermijnEind</w:t>
-            </w:r>
-            <w:proofErr w:type="spellEnd"/>
-            <w:r>
-              <w:rPr>
-                <w:rFonts w:ascii="Calibri" w:eastAsia="Calibri" w:hAnsi="Calibri" w:cs="Times New Roman"/>
-              </w:rPr>
-              <w:t xml:space="preserve"> bereikt is.</w:t>
+              <w:t>Indicator die aangeeft dat een Document uit het Archief verwijderd kan worden. Bijvoorbeeld om dat de BewaartermijnEind bereikt is.</w:t>
             </w:r>
           </w:p>
         </w:tc>
@@ -18069,14 +18095,12 @@
                 <w:rFonts w:ascii="Calibri" w:eastAsia="Calibri" w:hAnsi="Calibri" w:cs="Times New Roman"/>
               </w:rPr>
             </w:pPr>
-            <w:proofErr w:type="spellStart"/>
             <w:r>
               <w:rPr>
                 <w:rFonts w:ascii="Calibri" w:eastAsia="Calibri" w:hAnsi="Calibri" w:cs="Times New Roman"/>
               </w:rPr>
               <w:t>Groeptypering</w:t>
             </w:r>
-            <w:proofErr w:type="spellEnd"/>
           </w:p>
         </w:tc>
         <w:tc>
@@ -18241,14 +18265,12 @@
                 <w:rFonts w:ascii="Calibri" w:eastAsia="Calibri" w:hAnsi="Calibri" w:cs="Times New Roman"/>
               </w:rPr>
             </w:pPr>
-            <w:proofErr w:type="spellStart"/>
             <w:r>
               <w:rPr>
                 <w:rFonts w:ascii="Calibri" w:eastAsia="Calibri" w:hAnsi="Calibri" w:cs="Times New Roman"/>
               </w:rPr>
               <w:t>AanlegDatumTijd</w:t>
             </w:r>
-            <w:proofErr w:type="spellEnd"/>
           </w:p>
         </w:tc>
         <w:tc>
@@ -18725,35 +18747,7 @@
               <w:rPr>
                 <w:rFonts w:ascii="Calibri" w:eastAsia="Calibri" w:hAnsi="Calibri" w:cs="Times New Roman"/>
               </w:rPr>
-              <w:t>Naam waaronder het Document geregistreerd is (</w:t>
-            </w:r>
-            <w:proofErr w:type="spellStart"/>
-            <w:r>
-              <w:rPr>
-                <w:rFonts w:ascii="Calibri" w:eastAsia="Calibri" w:hAnsi="Calibri" w:cs="Times New Roman"/>
-              </w:rPr>
-              <w:t>Foreign</w:t>
-            </w:r>
-            <w:proofErr w:type="spellEnd"/>
-            <w:r>
-              <w:rPr>
-                <w:rFonts w:ascii="Calibri" w:eastAsia="Calibri" w:hAnsi="Calibri" w:cs="Times New Roman"/>
-              </w:rPr>
-              <w:t xml:space="preserve"> </w:t>
-            </w:r>
-            <w:proofErr w:type="spellStart"/>
-            <w:r>
-              <w:rPr>
-                <w:rFonts w:ascii="Calibri" w:eastAsia="Calibri" w:hAnsi="Calibri" w:cs="Times New Roman"/>
-              </w:rPr>
-              <w:t>key</w:t>
-            </w:r>
-            <w:proofErr w:type="spellEnd"/>
-            <w:r>
-              <w:rPr>
-                <w:rFonts w:ascii="Calibri" w:eastAsia="Calibri" w:hAnsi="Calibri" w:cs="Times New Roman"/>
-              </w:rPr>
-              <w:t>)</w:t>
+              <w:t>Naam waaronder het Document geregistreerd is (Foreign key)</w:t>
             </w:r>
           </w:p>
         </w:tc>
@@ -18771,14 +18765,12 @@
                 <w:rFonts w:ascii="Calibri" w:eastAsia="Calibri" w:hAnsi="Calibri" w:cs="Times New Roman"/>
               </w:rPr>
             </w:pPr>
-            <w:proofErr w:type="spellStart"/>
             <w:r>
               <w:rPr>
                 <w:rFonts w:ascii="Calibri" w:eastAsia="Calibri" w:hAnsi="Calibri" w:cs="Times New Roman"/>
               </w:rPr>
               <w:t>OpnameDatumTijd</w:t>
             </w:r>
-            <w:proofErr w:type="spellEnd"/>
           </w:p>
         </w:tc>
         <w:tc>
@@ -19209,14 +19201,12 @@
                 <w:rFonts w:ascii="Calibri" w:eastAsia="Calibri" w:hAnsi="Calibri" w:cs="Times New Roman"/>
               </w:rPr>
             </w:pPr>
-            <w:proofErr w:type="spellStart"/>
             <w:r>
               <w:rPr>
                 <w:rFonts w:ascii="Calibri" w:eastAsia="Calibri" w:hAnsi="Calibri" w:cs="Times New Roman"/>
               </w:rPr>
               <w:t>Groeptypering</w:t>
             </w:r>
-            <w:proofErr w:type="spellEnd"/>
           </w:p>
         </w:tc>
         <w:tc>
@@ -19379,14 +19369,12 @@
                 <w:rFonts w:ascii="Calibri" w:eastAsia="Calibri" w:hAnsi="Calibri" w:cs="Times New Roman"/>
               </w:rPr>
             </w:pPr>
-            <w:proofErr w:type="spellStart"/>
             <w:r>
               <w:rPr>
                 <w:rFonts w:ascii="Calibri" w:eastAsia="Calibri" w:hAnsi="Calibri" w:cs="Times New Roman"/>
               </w:rPr>
               <w:t>AanlegDatumTijd</w:t>
             </w:r>
-            <w:proofErr w:type="spellEnd"/>
           </w:p>
         </w:tc>
         <w:tc>
@@ -19804,14 +19792,12 @@
                 <w:rFonts w:ascii="Calibri" w:eastAsia="Calibri" w:hAnsi="Calibri" w:cs="Times New Roman"/>
               </w:rPr>
             </w:pPr>
-            <w:proofErr w:type="spellStart"/>
             <w:r>
               <w:rPr>
                 <w:rFonts w:ascii="Calibri" w:eastAsia="Calibri" w:hAnsi="Calibri" w:cs="Times New Roman"/>
               </w:rPr>
               <w:t>DocDossnaam</w:t>
             </w:r>
-            <w:proofErr w:type="spellEnd"/>
           </w:p>
         </w:tc>
         <w:tc>
@@ -19868,14 +19854,12 @@
                 <w:rFonts w:ascii="Calibri" w:eastAsia="Calibri" w:hAnsi="Calibri" w:cs="Times New Roman"/>
               </w:rPr>
             </w:pPr>
-            <w:proofErr w:type="spellStart"/>
             <w:r>
               <w:rPr>
                 <w:rFonts w:ascii="Calibri" w:eastAsia="Calibri" w:hAnsi="Calibri" w:cs="Times New Roman"/>
               </w:rPr>
               <w:t>OpnameDatumTijd</w:t>
             </w:r>
-            <w:proofErr w:type="spellEnd"/>
           </w:p>
         </w:tc>
         <w:tc>
@@ -20177,10 +20161,10 @@
                                 <w:color w:val="4F81BD"/>
                               </w:rPr>
                               <w:object w:dxaOrig="6468" w:dyaOrig="5867" w14:anchorId="067B551F">
-                                <v:shape id="_x0000_i1044" type="#_x0000_t75" style="width:288.15pt;height:261.1pt">
+                                <v:shape id="_x0000_i1034" type="#_x0000_t75" style="width:288.15pt;height:261.1pt">
                                   <v:imagedata r:id="rId36" o:title=""/>
                                 </v:shape>
-                                <o:OLEObject Type="Embed" ProgID="Visio.Drawing.11" ShapeID="_x0000_i1044" DrawAspect="Content" ObjectID="_1843131332" r:id="rId37"/>
+                                <o:OLEObject Type="Embed" ProgID="Visio.Drawing.11" ShapeID="_x0000_i1034" DrawAspect="Content" ObjectID="_1849866820" r:id="rId37"/>
                               </w:object>
                             </w:r>
                           </w:p>
@@ -20192,14 +20176,27 @@
                             <w:r>
                               <w:t xml:space="preserve">Figuur </w:t>
                             </w:r>
-                            <w:fldSimple w:instr=" SEQ Figuur \* ARABIC ">
-                              <w:r>
-                                <w:rPr>
-                                  <w:noProof/>
-                                </w:rPr>
-                                <w:t>7</w:t>
-                              </w:r>
-                            </w:fldSimple>
+                            <w:r>
+                              <w:fldChar w:fldCharType="begin"/>
+                            </w:r>
+                            <w:r>
+                              <w:instrText xml:space="preserve"> SEQ Figuur \* ARABIC </w:instrText>
+                            </w:r>
+                            <w:r>
+                              <w:fldChar w:fldCharType="separate"/>
+                            </w:r>
+                            <w:r>
+                              <w:rPr>
+                                <w:noProof/>
+                              </w:rPr>
+                              <w:t>7</w:t>
+                            </w:r>
+                            <w:r>
+                              <w:rPr>
+                                <w:noProof/>
+                              </w:rPr>
+                              <w:fldChar w:fldCharType="end"/>
+                            </w:r>
                             <w:r>
                               <w:t xml:space="preserve"> Datamodel </w:t>
                             </w:r>
@@ -20239,10 +20236,10 @@
                           <w:color w:val="4F81BD"/>
                         </w:rPr>
                         <w:object w:dxaOrig="6468" w:dyaOrig="5867" w14:anchorId="067B551F">
-                          <v:shape id="_x0000_i1044" type="#_x0000_t75" style="width:288.15pt;height:261.1pt">
+                          <v:shape id="_x0000_i1034" type="#_x0000_t75" style="width:288.15pt;height:261.1pt">
                             <v:imagedata r:id="rId36" o:title=""/>
                           </v:shape>
-                          <o:OLEObject Type="Embed" ProgID="Visio.Drawing.11" ShapeID="_x0000_i1044" DrawAspect="Content" ObjectID="_1843131332" r:id="rId38"/>
+                          <o:OLEObject Type="Embed" ProgID="Visio.Drawing.11" ShapeID="_x0000_i1034" DrawAspect="Content" ObjectID="_1849866820" r:id="rId38"/>
                         </w:object>
                       </w:r>
                     </w:p>
@@ -20254,14 +20251,27 @@
                       <w:r>
                         <w:t xml:space="preserve">Figuur </w:t>
                       </w:r>
-                      <w:fldSimple w:instr=" SEQ Figuur \* ARABIC ">
-                        <w:r>
-                          <w:rPr>
-                            <w:noProof/>
-                          </w:rPr>
-                          <w:t>7</w:t>
-                        </w:r>
-                      </w:fldSimple>
+                      <w:r>
+                        <w:fldChar w:fldCharType="begin"/>
+                      </w:r>
+                      <w:r>
+                        <w:instrText xml:space="preserve"> SEQ Figuur \* ARABIC </w:instrText>
+                      </w:r>
+                      <w:r>
+                        <w:fldChar w:fldCharType="separate"/>
+                      </w:r>
+                      <w:r>
+                        <w:rPr>
+                          <w:noProof/>
+                        </w:rPr>
+                        <w:t>7</w:t>
+                      </w:r>
+                      <w:r>
+                        <w:rPr>
+                          <w:noProof/>
+                        </w:rPr>
+                        <w:fldChar w:fldCharType="end"/>
+                      </w:r>
                       <w:r>
                         <w:t xml:space="preserve"> Datamodel </w:t>
                       </w:r>
@@ -20550,7 +20560,7 @@
           <w:szCs w:val="22"/>
           <w14:ligatures w14:val="none"/>
         </w:rPr>
-        <w:t>groep rondom het gezin. De Kring bestaat uit het gezin, de familie, vrienden en kennissen. Voorbeelden van personen zijn: gezinslid of familielid, kennis. Van groepen: gezin, familie of vrienden.</w:t>
+        <w:t>groep rondom het gezin. De Kring bestaat uit het gezin, de familie, vrienden en kennissen. Voorbeelden van personen zijn: gezinslid of familielid, kennis.</w:t>
       </w:r>
     </w:p>
     <w:p>
@@ -20737,42 +20747,7 @@
               <w:rPr>
                 <w:rFonts w:ascii="Calibri" w:eastAsia="Calibri" w:hAnsi="Calibri" w:cs="Calibri"/>
               </w:rPr>
-              <w:t xml:space="preserve"> is de naam van een persoon </w:t>
-            </w:r>
-            <w:r>
-              <w:rPr>
-                <w:rFonts w:ascii="Calibri" w:eastAsia="Calibri" w:hAnsi="Calibri" w:cs="Calibri"/>
-              </w:rPr>
-              <w:lastRenderedPageBreak/>
-              <w:t xml:space="preserve">(Persoonsnaam; </w:t>
-            </w:r>
-            <w:proofErr w:type="spellStart"/>
-            <w:r>
-              <w:rPr>
-                <w:rFonts w:ascii="Calibri" w:eastAsia="Calibri" w:hAnsi="Calibri" w:cs="Calibri"/>
-              </w:rPr>
-              <w:t>Pn</w:t>
-            </w:r>
-            <w:proofErr w:type="spellEnd"/>
-            <w:r>
-              <w:rPr>
-                <w:rFonts w:ascii="Calibri" w:eastAsia="Calibri" w:hAnsi="Calibri" w:cs="Calibri"/>
-              </w:rPr>
-              <w:t xml:space="preserve">), het Kringlid, of Kring (Groepsnaam; </w:t>
-            </w:r>
-            <w:proofErr w:type="spellStart"/>
-            <w:r>
-              <w:rPr>
-                <w:rFonts w:ascii="Calibri" w:eastAsia="Calibri" w:hAnsi="Calibri" w:cs="Calibri"/>
-              </w:rPr>
-              <w:t>Gn</w:t>
-            </w:r>
-            <w:proofErr w:type="spellEnd"/>
-            <w:r>
-              <w:rPr>
-                <w:rFonts w:ascii="Calibri" w:eastAsia="Calibri" w:hAnsi="Calibri" w:cs="Calibri"/>
-              </w:rPr>
-              <w:t>).</w:t>
+              <w:t xml:space="preserve"> is de naam van een persoon (Persoonsnaam; Pn), het Kringlid, of Kring (Groepsnaam; Gn).</w:t>
             </w:r>
           </w:p>
           <w:p>
@@ -20783,19 +20758,12 @@
                 <w:rFonts w:ascii="Calibri" w:eastAsia="Calibri" w:hAnsi="Calibri" w:cs="Calibri"/>
               </w:rPr>
             </w:pPr>
-            <w:proofErr w:type="spellStart"/>
             <w:r>
               <w:rPr>
                 <w:rFonts w:ascii="Calibri" w:eastAsia="Calibri" w:hAnsi="Calibri" w:cs="Calibri"/>
               </w:rPr>
-              <w:t>Pn</w:t>
-            </w:r>
-            <w:proofErr w:type="spellEnd"/>
-            <w:r>
-              <w:rPr>
-                <w:rFonts w:ascii="Calibri" w:eastAsia="Calibri" w:hAnsi="Calibri" w:cs="Calibri"/>
-              </w:rPr>
-              <w:t xml:space="preserve"> is: {Achternaam, [Voornaam], [Tussenvoegsel]}</w:t>
+              <w:lastRenderedPageBreak/>
+              <w:t>Pn is: {Achternaam, [Voornaam], [Tussenvoegsel]}</w:t>
             </w:r>
           </w:p>
           <w:p>
@@ -20806,19 +20774,11 @@
                 <w:rFonts w:ascii="Calibri" w:eastAsia="Calibri" w:hAnsi="Calibri" w:cs="Calibri"/>
               </w:rPr>
             </w:pPr>
-            <w:proofErr w:type="spellStart"/>
             <w:r>
               <w:rPr>
                 <w:rFonts w:ascii="Calibri" w:eastAsia="Calibri" w:hAnsi="Calibri" w:cs="Calibri"/>
               </w:rPr>
-              <w:t>Kn</w:t>
-            </w:r>
-            <w:proofErr w:type="spellEnd"/>
-            <w:r>
-              <w:rPr>
-                <w:rFonts w:ascii="Calibri" w:eastAsia="Calibri" w:hAnsi="Calibri" w:cs="Calibri"/>
-              </w:rPr>
-              <w:t xml:space="preserve"> is: {Achternaam, [ Voornaam],  [Tussenvoegsel]}.</w:t>
+              <w:t>Kn is: {Achternaam, [ Voornaam],  [Tussenvoegsel]}.</w:t>
             </w:r>
           </w:p>
         </w:tc>
@@ -20928,75 +20888,43 @@
                 <w:rFonts w:ascii="Calibri" w:eastAsia="Calibri" w:hAnsi="Calibri" w:cs="Calibri"/>
                 <w:lang w:eastAsia="nl-NL"/>
               </w:rPr>
-              <w:t xml:space="preserve"> Documenten gezien en ingezien worden; Documenten met </w:t>
-            </w:r>
-            <w:proofErr w:type="spellStart"/>
+              <w:t xml:space="preserve"> Documenten gezien en ingezien worden; Documenten met BeperkingInGebruik: OP, No, V en NB</w:t>
+            </w:r>
+          </w:p>
+          <w:p>
+            <w:pPr>
+              <w:spacing w:before="100" w:beforeAutospacing="1" w:after="100" w:afterAutospacing="1"/>
+              <w:rPr>
+                <w:rFonts w:ascii="Calibri" w:eastAsia="Calibri" w:hAnsi="Calibri" w:cs="Calibri"/>
+              </w:rPr>
+            </w:pPr>
+            <w:r>
+              <w:rPr>
+                <w:rFonts w:ascii="Calibri" w:eastAsia="Times New Roman" w:hAnsi="Calibri" w:cs="Calibri"/>
+                <w:lang w:eastAsia="nl-NL"/>
+              </w:rPr>
+              <w:t xml:space="preserve">Als de </w:t>
+            </w:r>
+            <w:r>
+              <w:rPr>
+                <w:rFonts w:ascii="Calibri" w:eastAsia="Times New Roman" w:hAnsi="Calibri" w:cs="Calibri"/>
+                <w:lang w:eastAsia="nl-NL"/>
+              </w:rPr>
+              <w:t>Kringlidtypering</w:t>
+            </w:r>
+            <w:r>
+              <w:rPr>
+                <w:rFonts w:ascii="Calibri" w:eastAsia="Times New Roman" w:hAnsi="Calibri" w:cs="Calibri"/>
+                <w:lang w:eastAsia="nl-NL"/>
+              </w:rPr>
+              <w:t xml:space="preserve"> = ‘Kind’, dan kunnen alle </w:t>
+            </w:r>
             <w:r>
               <w:rPr>
                 <w:rFonts w:ascii="Calibri" w:eastAsia="Calibri" w:hAnsi="Calibri" w:cs="Calibri"/>
                 <w:lang w:eastAsia="nl-NL"/>
               </w:rPr>
-              <w:t>BeperkingInGebruik</w:t>
-            </w:r>
-            <w:proofErr w:type="spellEnd"/>
-            <w:r>
-              <w:rPr>
-                <w:rFonts w:ascii="Calibri" w:eastAsia="Calibri" w:hAnsi="Calibri" w:cs="Calibri"/>
-                <w:lang w:eastAsia="nl-NL"/>
-              </w:rPr>
-              <w:t>: OP, No, V en NB</w:t>
-            </w:r>
-          </w:p>
-          <w:p>
-            <w:pPr>
-              <w:spacing w:before="100" w:beforeAutospacing="1" w:after="100" w:afterAutospacing="1"/>
-              <w:rPr>
-                <w:rFonts w:ascii="Calibri" w:eastAsia="Calibri" w:hAnsi="Calibri" w:cs="Calibri"/>
-              </w:rPr>
-            </w:pPr>
-            <w:r>
-              <w:rPr>
-                <w:rFonts w:ascii="Calibri" w:eastAsia="Times New Roman" w:hAnsi="Calibri" w:cs="Calibri"/>
-                <w:lang w:eastAsia="nl-NL"/>
-              </w:rPr>
-              <w:t xml:space="preserve">Als de </w:t>
-            </w:r>
-            <w:r>
-              <w:rPr>
-                <w:rFonts w:ascii="Calibri" w:eastAsia="Times New Roman" w:hAnsi="Calibri" w:cs="Calibri"/>
-                <w:lang w:eastAsia="nl-NL"/>
-              </w:rPr>
-              <w:t>Kringlidtypering</w:t>
-            </w:r>
-            <w:r>
-              <w:rPr>
-                <w:rFonts w:ascii="Calibri" w:eastAsia="Times New Roman" w:hAnsi="Calibri" w:cs="Calibri"/>
-                <w:lang w:eastAsia="nl-NL"/>
-              </w:rPr>
-              <w:t xml:space="preserve"> = ‘Kind’, dan kunnen alle </w:t>
-            </w:r>
-            <w:r>
-              <w:rPr>
-                <w:rFonts w:ascii="Calibri" w:eastAsia="Calibri" w:hAnsi="Calibri" w:cs="Calibri"/>
-                <w:lang w:eastAsia="nl-NL"/>
-              </w:rPr>
-              <w:t xml:space="preserve"> Documenten gezien maar niet alle Documenten ingezien worden; Documenten met </w:t>
-            </w:r>
-            <w:proofErr w:type="spellStart"/>
-            <w:r>
-              <w:rPr>
-                <w:rFonts w:ascii="Calibri" w:eastAsia="Calibri" w:hAnsi="Calibri" w:cs="Calibri"/>
-                <w:lang w:eastAsia="nl-NL"/>
-              </w:rPr>
-              <w:t>BeperkingInGebruik</w:t>
-            </w:r>
-            <w:proofErr w:type="spellEnd"/>
-            <w:r>
-              <w:rPr>
-                <w:rFonts w:ascii="Calibri" w:eastAsia="Calibri" w:hAnsi="Calibri" w:cs="Calibri"/>
-                <w:lang w:eastAsia="nl-NL"/>
-              </w:rPr>
-              <w:t>: OP, No.</w:t>
+              <w:t xml:space="preserve"> Documenten gezien maar niet alle Documenten ingezien worden; Documenten met BeperkingInGebruik: OP, No.</w:t>
             </w:r>
           </w:p>
         </w:tc>
@@ -21187,19 +21115,11 @@
                 <w:rFonts w:ascii="Calibri" w:eastAsia="Calibri" w:hAnsi="Calibri" w:cs="Calibri"/>
               </w:rPr>
             </w:pPr>
-            <w:proofErr w:type="spellStart"/>
             <w:r>
               <w:rPr>
                 <w:rFonts w:ascii="Calibri" w:eastAsia="Calibri" w:hAnsi="Calibri" w:cs="Calibri"/>
               </w:rPr>
-              <w:t>Vn</w:t>
-            </w:r>
-            <w:proofErr w:type="spellEnd"/>
-            <w:r>
-              <w:rPr>
-                <w:rFonts w:ascii="Calibri" w:eastAsia="Calibri" w:hAnsi="Calibri" w:cs="Calibri"/>
-              </w:rPr>
-              <w:t>. De voornaam van de persoon of groep</w:t>
+              <w:t>Vn. De voornaam van de persoon of groep</w:t>
             </w:r>
           </w:p>
         </w:tc>
@@ -21317,33 +21237,11 @@
                 <w:rFonts w:ascii="Calibri" w:eastAsia="Calibri" w:hAnsi="Calibri" w:cs="Calibri"/>
               </w:rPr>
             </w:pPr>
-            <w:proofErr w:type="spellStart"/>
             <w:r>
               <w:rPr>
                 <w:rFonts w:ascii="Calibri" w:eastAsia="Calibri" w:hAnsi="Calibri" w:cs="Calibri"/>
               </w:rPr>
-              <w:t>Wa</w:t>
-            </w:r>
-            <w:proofErr w:type="spellEnd"/>
-            <w:r>
-              <w:rPr>
-                <w:rFonts w:ascii="Calibri" w:eastAsia="Calibri" w:hAnsi="Calibri" w:cs="Calibri"/>
-              </w:rPr>
-              <w:t xml:space="preserve">. Woonplaats én adres as één string. Bijvoorbeeld “Haaksbergen, </w:t>
-            </w:r>
-            <w:proofErr w:type="spellStart"/>
-            <w:r>
-              <w:rPr>
-                <w:rFonts w:ascii="Calibri" w:eastAsia="Calibri" w:hAnsi="Calibri" w:cs="Calibri"/>
-              </w:rPr>
-              <w:t>Stiegert</w:t>
-            </w:r>
-            <w:proofErr w:type="spellEnd"/>
-            <w:r>
-              <w:rPr>
-                <w:rFonts w:ascii="Calibri" w:eastAsia="Calibri" w:hAnsi="Calibri" w:cs="Calibri"/>
-              </w:rPr>
-              <w:t xml:space="preserve"> 68”.</w:t>
+              <w:t>Wa. Woonplaats én adres as één string. Bijvoorbeeld “Haaksbergen, Stiegert 68”.</w:t>
             </w:r>
           </w:p>
         </w:tc>
@@ -21573,14 +21471,12 @@
                 <w:rFonts w:ascii="Calibri" w:eastAsia="Calibri" w:hAnsi="Calibri" w:cs="Calibri"/>
               </w:rPr>
             </w:pPr>
-            <w:proofErr w:type="spellStart"/>
             <w:r>
               <w:rPr>
                 <w:rFonts w:ascii="Calibri" w:eastAsia="Calibri" w:hAnsi="Calibri" w:cs="Calibri"/>
               </w:rPr>
               <w:t>TijdelijkPIN</w:t>
             </w:r>
-            <w:proofErr w:type="spellEnd"/>
           </w:p>
         </w:tc>
         <w:tc>
@@ -21926,10 +21822,10 @@
                                 <w:noProof/>
                               </w:rPr>
                               <w:object w:dxaOrig="4872" w:dyaOrig="4871" w14:anchorId="0A04CA07">
-                                <v:shape id="_x0000_i1046" type="#_x0000_t75" style="width:247.5pt;height:247.45pt">
+                                <v:shape id="_x0000_i1035" type="#_x0000_t75" style="width:247.5pt;height:247.45pt">
                                   <v:imagedata r:id="rId39" o:title=""/>
                                 </v:shape>
-                                <o:OLEObject Type="Embed" ProgID="Visio.Drawing.15" ShapeID="_x0000_i1046" DrawAspect="Content" ObjectID="_1843131333" r:id="rId40"/>
+                                <o:OLEObject Type="Embed" ProgID="Visio.Drawing.15" ShapeID="_x0000_i1035" DrawAspect="Content" ObjectID="_1849866821" r:id="rId40"/>
                               </w:object>
                             </w:r>
                           </w:p>
@@ -21942,14 +21838,27 @@
                             <w:r>
                               <w:t xml:space="preserve">Figuur </w:t>
                             </w:r>
-                            <w:fldSimple w:instr=" SEQ Figuur \* ARABIC ">
-                              <w:r>
-                                <w:rPr>
-                                  <w:noProof/>
-                                </w:rPr>
-                                <w:t>8</w:t>
-                              </w:r>
-                            </w:fldSimple>
+                            <w:r>
+                              <w:fldChar w:fldCharType="begin"/>
+                            </w:r>
+                            <w:r>
+                              <w:instrText xml:space="preserve"> SEQ Figuur \* ARABIC </w:instrText>
+                            </w:r>
+                            <w:r>
+                              <w:fldChar w:fldCharType="separate"/>
+                            </w:r>
+                            <w:r>
+                              <w:rPr>
+                                <w:noProof/>
+                              </w:rPr>
+                              <w:t>8</w:t>
+                            </w:r>
+                            <w:r>
+                              <w:rPr>
+                                <w:noProof/>
+                              </w:rPr>
+                              <w:fldChar w:fldCharType="end"/>
+                            </w:r>
                             <w:r>
                               <w:t xml:space="preserve"> “Kring verbanden</w:t>
                             </w:r>
@@ -21997,10 +21906,10 @@
                           <w:noProof/>
                         </w:rPr>
                         <w:object w:dxaOrig="4872" w:dyaOrig="4871" w14:anchorId="0A04CA07">
-                          <v:shape id="_x0000_i1046" type="#_x0000_t75" style="width:247.5pt;height:247.45pt">
+                          <v:shape id="_x0000_i1035" type="#_x0000_t75" style="width:247.5pt;height:247.45pt">
                             <v:imagedata r:id="rId39" o:title=""/>
                           </v:shape>
-                          <o:OLEObject Type="Embed" ProgID="Visio.Drawing.15" ShapeID="_x0000_i1046" DrawAspect="Content" ObjectID="_1843131333" r:id="rId41"/>
+                          <o:OLEObject Type="Embed" ProgID="Visio.Drawing.15" ShapeID="_x0000_i1035" DrawAspect="Content" ObjectID="_1849866821" r:id="rId41"/>
                         </w:object>
                       </w:r>
                     </w:p>
@@ -22013,14 +21922,27 @@
                       <w:r>
                         <w:t xml:space="preserve">Figuur </w:t>
                       </w:r>
-                      <w:fldSimple w:instr=" SEQ Figuur \* ARABIC ">
-                        <w:r>
-                          <w:rPr>
-                            <w:noProof/>
-                          </w:rPr>
-                          <w:t>8</w:t>
-                        </w:r>
-                      </w:fldSimple>
+                      <w:r>
+                        <w:fldChar w:fldCharType="begin"/>
+                      </w:r>
+                      <w:r>
+                        <w:instrText xml:space="preserve"> SEQ Figuur \* ARABIC </w:instrText>
+                      </w:r>
+                      <w:r>
+                        <w:fldChar w:fldCharType="separate"/>
+                      </w:r>
+                      <w:r>
+                        <w:rPr>
+                          <w:noProof/>
+                        </w:rPr>
+                        <w:t>8</w:t>
+                      </w:r>
+                      <w:r>
+                        <w:rPr>
+                          <w:noProof/>
+                        </w:rPr>
+                        <w:fldChar w:fldCharType="end"/>
+                      </w:r>
                       <w:r>
                         <w:t xml:space="preserve"> “Kring verbanden</w:t>
                       </w:r>
@@ -22472,35 +22394,7 @@
               <w:rPr>
                 <w:rFonts w:ascii="Calibri" w:eastAsia="Calibri" w:hAnsi="Calibri" w:cs="Times New Roman"/>
               </w:rPr>
-              <w:t>Naam van een Relatie. De Relatienaam kan zijn de naam van een persoon (Persoonsnaam; “</w:t>
-            </w:r>
-            <w:proofErr w:type="spellStart"/>
-            <w:r>
-              <w:rPr>
-                <w:rFonts w:ascii="Calibri" w:eastAsia="Calibri" w:hAnsi="Calibri" w:cs="Times New Roman"/>
-              </w:rPr>
-              <w:t>Pn</w:t>
-            </w:r>
-            <w:proofErr w:type="spellEnd"/>
-            <w:r>
-              <w:rPr>
-                <w:rFonts w:ascii="Calibri" w:eastAsia="Calibri" w:hAnsi="Calibri" w:cs="Times New Roman"/>
-              </w:rPr>
-              <w:t>”), de naam van een organisatie (Organisatienaam; “On”) of een combinatie daarvan: een persoon uit een organisatie; “</w:t>
-            </w:r>
-            <w:proofErr w:type="spellStart"/>
-            <w:r>
-              <w:rPr>
-                <w:rFonts w:ascii="Calibri" w:eastAsia="Calibri" w:hAnsi="Calibri" w:cs="Times New Roman"/>
-              </w:rPr>
-              <w:t>Pn</w:t>
-            </w:r>
-            <w:proofErr w:type="spellEnd"/>
-            <w:r>
-              <w:rPr>
-                <w:rFonts w:ascii="Calibri" w:eastAsia="Calibri" w:hAnsi="Calibri" w:cs="Times New Roman"/>
-              </w:rPr>
-              <w:t xml:space="preserve"> On”.</w:t>
+              <w:t>Naam van een Relatie. De Relatienaam kan zijn de naam van een persoon (Persoonsnaam; “Pn”), de naam van een organisatie (Organisatienaam; “On”) of een combinatie daarvan: een persoon uit een organisatie; “Pn On”.</w:t>
             </w:r>
           </w:p>
           <w:p>
@@ -22511,19 +22405,11 @@
                 <w:rFonts w:ascii="Calibri" w:eastAsia="Calibri" w:hAnsi="Calibri" w:cs="Times New Roman"/>
               </w:rPr>
             </w:pPr>
-            <w:proofErr w:type="spellStart"/>
-            <w:r>
-              <w:rPr>
-                <w:rFonts w:ascii="Calibri" w:eastAsia="Calibri" w:hAnsi="Calibri" w:cs="Times New Roman"/>
-              </w:rPr>
-              <w:t>Pn</w:t>
-            </w:r>
-            <w:proofErr w:type="spellEnd"/>
-            <w:r>
-              <w:rPr>
-                <w:rFonts w:ascii="Calibri" w:eastAsia="Calibri" w:hAnsi="Calibri" w:cs="Times New Roman"/>
-              </w:rPr>
-              <w:t xml:space="preserve"> is: {Achternaam[, ][Voornaam], [Tussenvoegsel]}.</w:t>
+            <w:r>
+              <w:rPr>
+                <w:rFonts w:ascii="Calibri" w:eastAsia="Calibri" w:hAnsi="Calibri" w:cs="Times New Roman"/>
+              </w:rPr>
+              <w:t>Pn is: {Achternaam[, ][Voornaam], [Tussenvoegsel]}.</w:t>
             </w:r>
           </w:p>
           <w:p>
@@ -22550,19 +22436,11 @@
                 <w:rFonts w:ascii="Calibri" w:eastAsia="Calibri" w:hAnsi="Calibri" w:cs="Times New Roman"/>
               </w:rPr>
             </w:pPr>
-            <w:proofErr w:type="spellStart"/>
-            <w:r>
-              <w:rPr>
-                <w:rFonts w:ascii="Calibri" w:eastAsia="Calibri" w:hAnsi="Calibri" w:cs="Times New Roman"/>
-              </w:rPr>
-              <w:t>Pn</w:t>
-            </w:r>
-            <w:proofErr w:type="spellEnd"/>
-            <w:r>
-              <w:rPr>
-                <w:rFonts w:ascii="Calibri" w:eastAsia="Calibri" w:hAnsi="Calibri" w:cs="Times New Roman"/>
-              </w:rPr>
-              <w:t xml:space="preserve"> On is: {[Persoonsnaam][ ][Organisatienaam]}; één string.</w:t>
+            <w:r>
+              <w:rPr>
+                <w:rFonts w:ascii="Calibri" w:eastAsia="Calibri" w:hAnsi="Calibri" w:cs="Times New Roman"/>
+              </w:rPr>
+              <w:t>Pn On is: {[Persoonsnaam][ ][Organisatienaam]}; één string.</w:t>
             </w:r>
           </w:p>
           <w:p>
@@ -22736,7 +22614,6 @@
                 <w:rFonts w:ascii="Calibri" w:eastAsia="Calibri" w:hAnsi="Calibri" w:cs="Times New Roman"/>
               </w:rPr>
             </w:pPr>
-            <w:proofErr w:type="spellStart"/>
             <w:r>
               <w:rPr>
                 <w:rFonts w:ascii="Calibri" w:eastAsia="Calibri" w:hAnsi="Calibri" w:cs="Times New Roman"/>
@@ -22761,7 +22638,6 @@
               </w:rPr>
               <w:t>ypering</w:t>
             </w:r>
-            <w:proofErr w:type="spellEnd"/>
           </w:p>
         </w:tc>
         <w:tc>
@@ -22936,19 +22812,11 @@
                 <w:rFonts w:ascii="Calibri" w:eastAsia="Calibri" w:hAnsi="Calibri" w:cs="Times New Roman"/>
               </w:rPr>
             </w:pPr>
-            <w:proofErr w:type="spellStart"/>
-            <w:r>
-              <w:rPr>
-                <w:rFonts w:ascii="Calibri" w:eastAsia="Calibri" w:hAnsi="Calibri" w:cs="Times New Roman"/>
-              </w:rPr>
-              <w:t>Vn</w:t>
-            </w:r>
-            <w:proofErr w:type="spellEnd"/>
-            <w:r>
-              <w:rPr>
-                <w:rFonts w:ascii="Calibri" w:eastAsia="Calibri" w:hAnsi="Calibri" w:cs="Times New Roman"/>
-              </w:rPr>
-              <w:t>. Ingeval Relatie is een persoon, de voornaam van de persoon</w:t>
+            <w:r>
+              <w:rPr>
+                <w:rFonts w:ascii="Calibri" w:eastAsia="Calibri" w:hAnsi="Calibri" w:cs="Times New Roman"/>
+              </w:rPr>
+              <w:t>Vn. Ingeval Relatie is een persoon, de voornaam van de persoon</w:t>
             </w:r>
           </w:p>
         </w:tc>
@@ -23066,33 +22934,11 @@
                 <w:rFonts w:ascii="Calibri" w:eastAsia="Calibri" w:hAnsi="Calibri" w:cs="Times New Roman"/>
               </w:rPr>
             </w:pPr>
-            <w:proofErr w:type="spellStart"/>
-            <w:r>
-              <w:rPr>
-                <w:rFonts w:ascii="Calibri" w:eastAsia="Calibri" w:hAnsi="Calibri" w:cs="Times New Roman"/>
-              </w:rPr>
-              <w:t>Wa</w:t>
-            </w:r>
-            <w:proofErr w:type="spellEnd"/>
-            <w:r>
-              <w:rPr>
-                <w:rFonts w:ascii="Calibri" w:eastAsia="Calibri" w:hAnsi="Calibri" w:cs="Times New Roman"/>
-              </w:rPr>
-              <w:t xml:space="preserve">. Woonplaats én adres als één string. Bijvoorbeeld “Haaksbergen, </w:t>
-            </w:r>
-            <w:proofErr w:type="spellStart"/>
-            <w:r>
-              <w:rPr>
-                <w:rFonts w:ascii="Calibri" w:eastAsia="Calibri" w:hAnsi="Calibri" w:cs="Times New Roman"/>
-              </w:rPr>
-              <w:t>Stiegert</w:t>
-            </w:r>
-            <w:proofErr w:type="spellEnd"/>
-            <w:r>
-              <w:rPr>
-                <w:rFonts w:ascii="Calibri" w:eastAsia="Calibri" w:hAnsi="Calibri" w:cs="Times New Roman"/>
-              </w:rPr>
-              <w:t xml:space="preserve"> 68”.</w:t>
+            <w:r>
+              <w:rPr>
+                <w:rFonts w:ascii="Calibri" w:eastAsia="Calibri" w:hAnsi="Calibri" w:cs="Times New Roman"/>
+              </w:rPr>
+              <w:t>Wa. Woonplaats én adres als één string. Bijvoorbeeld “Haaksbergen, Stiegert 68”.</w:t>
             </w:r>
           </w:p>
         </w:tc>
@@ -23319,14 +23165,12 @@
                 <w:rFonts w:ascii="Calibri" w:eastAsia="Calibri" w:hAnsi="Calibri" w:cs="Times New Roman"/>
               </w:rPr>
             </w:pPr>
-            <w:proofErr w:type="spellStart"/>
             <w:r>
               <w:rPr>
                 <w:rFonts w:ascii="Calibri" w:eastAsia="Calibri" w:hAnsi="Calibri" w:cs="Times New Roman"/>
               </w:rPr>
               <w:t>VorigeNaam</w:t>
             </w:r>
-            <w:proofErr w:type="spellEnd"/>
           </w:p>
         </w:tc>
         <w:tc>
@@ -23486,14 +23330,12 @@
                 <w:rFonts w:ascii="Calibri" w:eastAsia="Calibri" w:hAnsi="Calibri" w:cs="Times New Roman"/>
               </w:rPr>
             </w:pPr>
-            <w:proofErr w:type="spellStart"/>
             <w:r>
               <w:rPr>
                 <w:rFonts w:ascii="Calibri" w:eastAsia="Calibri" w:hAnsi="Calibri" w:cs="Times New Roman"/>
               </w:rPr>
               <w:t>DownloadLink</w:t>
             </w:r>
-            <w:proofErr w:type="spellEnd"/>
           </w:p>
         </w:tc>
         <w:tc>
@@ -23549,14 +23391,12 @@
                 <w:rFonts w:ascii="Calibri" w:eastAsia="Calibri" w:hAnsi="Calibri" w:cs="Times New Roman"/>
               </w:rPr>
             </w:pPr>
-            <w:proofErr w:type="spellStart"/>
             <w:r>
               <w:rPr>
                 <w:rFonts w:ascii="Calibri" w:eastAsia="Calibri" w:hAnsi="Calibri" w:cs="Times New Roman"/>
               </w:rPr>
               <w:t>DownLoadNaam</w:t>
             </w:r>
-            <w:proofErr w:type="spellEnd"/>
           </w:p>
         </w:tc>
         <w:tc>
@@ -23589,16 +23429,8 @@
               <w:rPr>
                 <w:rFonts w:ascii="Calibri" w:eastAsia="Calibri" w:hAnsi="Calibri" w:cs="Times New Roman"/>
               </w:rPr>
-              <w:t xml:space="preserve">Gebruikersnaam bij de </w:t>
-            </w:r>
-            <w:proofErr w:type="spellStart"/>
-            <w:r>
-              <w:rPr>
-                <w:rFonts w:ascii="Calibri" w:eastAsia="Calibri" w:hAnsi="Calibri" w:cs="Times New Roman"/>
-              </w:rPr>
-              <w:t>DownloadLink</w:t>
-            </w:r>
-            <w:proofErr w:type="spellEnd"/>
+              <w:t>Gebruikersnaam bij de DownloadLink</w:t>
+            </w:r>
           </w:p>
         </w:tc>
       </w:tr>
@@ -23614,14 +23446,12 @@
                 <w:rFonts w:ascii="Calibri" w:eastAsia="Calibri" w:hAnsi="Calibri" w:cs="Times New Roman"/>
               </w:rPr>
             </w:pPr>
-            <w:proofErr w:type="spellStart"/>
             <w:r>
               <w:rPr>
                 <w:rFonts w:ascii="Calibri" w:eastAsia="Calibri" w:hAnsi="Calibri" w:cs="Times New Roman"/>
               </w:rPr>
               <w:t>Downloadww</w:t>
             </w:r>
-            <w:proofErr w:type="spellEnd"/>
           </w:p>
         </w:tc>
         <w:tc>
@@ -23650,28 +23480,12 @@
                 <w:rFonts w:ascii="Calibri" w:eastAsia="Calibri" w:hAnsi="Calibri" w:cs="Times New Roman"/>
               </w:rPr>
             </w:pPr>
-            <w:proofErr w:type="spellStart"/>
-            <w:r>
-              <w:rPr>
-                <w:rFonts w:ascii="Calibri" w:eastAsia="Calibri" w:hAnsi="Calibri" w:cs="Times New Roman"/>
-              </w:rPr>
-              <w:t>Ww</w:t>
-            </w:r>
-            <w:proofErr w:type="spellEnd"/>
-            <w:r>
-              <w:rPr>
-                <w:rFonts w:ascii="Calibri" w:eastAsia="Calibri" w:hAnsi="Calibri" w:cs="Times New Roman"/>
-              </w:rPr>
-              <w:t xml:space="preserve"> bij de </w:t>
-            </w:r>
-            <w:proofErr w:type="spellStart"/>
-            <w:r>
-              <w:rPr>
-                <w:rFonts w:ascii="Calibri" w:eastAsia="Calibri" w:hAnsi="Calibri" w:cs="Times New Roman"/>
-              </w:rPr>
-              <w:t>DownloadLink</w:t>
-            </w:r>
-            <w:proofErr w:type="spellEnd"/>
+            <w:r>
+              <w:rPr>
+                <w:rFonts w:ascii="Calibri" w:eastAsia="Calibri" w:hAnsi="Calibri" w:cs="Times New Roman"/>
+              </w:rPr>
+              <w:t>Ww bij de DownloadLink</w:t>
+            </w:r>
           </w:p>
         </w:tc>
       </w:tr>
@@ -24061,14 +23875,12 @@
                 <w:rFonts w:ascii="Calibri" w:eastAsia="Calibri" w:hAnsi="Calibri" w:cs="Times New Roman"/>
               </w:rPr>
             </w:pPr>
-            <w:proofErr w:type="spellStart"/>
             <w:r>
               <w:rPr>
                 <w:rFonts w:ascii="Calibri" w:eastAsia="Calibri" w:hAnsi="Calibri" w:cs="Times New Roman"/>
               </w:rPr>
               <w:t>DekkingInOnderwerp</w:t>
             </w:r>
-            <w:proofErr w:type="spellEnd"/>
           </w:p>
         </w:tc>
         <w:tc>
@@ -24492,14 +24304,12 @@
                 <w:rFonts w:ascii="Calibri" w:eastAsia="Calibri" w:hAnsi="Calibri" w:cs="Times New Roman"/>
               </w:rPr>
             </w:pPr>
-            <w:proofErr w:type="spellStart"/>
             <w:r>
               <w:rPr>
                 <w:rFonts w:ascii="Calibri" w:eastAsia="Calibri" w:hAnsi="Calibri" w:cs="Times New Roman"/>
               </w:rPr>
               <w:t>DatumTijd</w:t>
             </w:r>
-            <w:proofErr w:type="spellEnd"/>
           </w:p>
         </w:tc>
         <w:tc>
@@ -25340,14 +25150,12 @@
                 <w:rFonts w:ascii="Calibri" w:eastAsia="Calibri" w:hAnsi="Calibri" w:cs="Times New Roman"/>
               </w:rPr>
             </w:pPr>
-            <w:proofErr w:type="spellStart"/>
             <w:r>
               <w:rPr>
                 <w:rFonts w:ascii="Calibri" w:eastAsia="Calibri" w:hAnsi="Calibri" w:cs="Times New Roman"/>
               </w:rPr>
               <w:t>DatumTijd</w:t>
             </w:r>
-            <w:proofErr w:type="spellEnd"/>
           </w:p>
         </w:tc>
         <w:tc>
@@ -25795,56 +25603,36 @@
                 <w:bCs/>
               </w:rPr>
             </w:pPr>
-            <w:proofErr w:type="spellStart"/>
             <w:r>
               <w:rPr>
                 <w:rFonts w:ascii="Calibri" w:eastAsia="Calibri" w:hAnsi="Calibri" w:cs="Calibri"/>
                 <w:b/>
                 <w:bCs/>
               </w:rPr>
-              <w:t>Dt</w:t>
-            </w:r>
-            <w:proofErr w:type="spellEnd"/>
-            <w:r>
+              <w:t>Dt=Boek</w:t>
+            </w:r>
+          </w:p>
+        </w:tc>
+        <w:tc>
+          <w:tcPr>
+            <w:tcW w:w="2857" w:type="dxa"/>
+          </w:tcPr>
+          <w:p>
+            <w:pPr>
+              <w:spacing w:before="100" w:beforeAutospacing="1" w:after="100" w:afterAutospacing="1"/>
               <w:rPr>
                 <w:rFonts w:ascii="Calibri" w:eastAsia="Calibri" w:hAnsi="Calibri" w:cs="Calibri"/>
                 <w:b/>
                 <w:bCs/>
               </w:rPr>
-              <w:t>=Boek</w:t>
-            </w:r>
-          </w:p>
-        </w:tc>
-        <w:tc>
-          <w:tcPr>
-            <w:tcW w:w="2857" w:type="dxa"/>
-          </w:tcPr>
-          <w:p>
-            <w:pPr>
-              <w:spacing w:before="100" w:beforeAutospacing="1" w:after="100" w:afterAutospacing="1"/>
+            </w:pPr>
+            <w:r>
               <w:rPr>
                 <w:rFonts w:ascii="Calibri" w:eastAsia="Calibri" w:hAnsi="Calibri" w:cs="Calibri"/>
                 <w:b/>
                 <w:bCs/>
               </w:rPr>
-            </w:pPr>
-            <w:proofErr w:type="spellStart"/>
-            <w:r>
-              <w:rPr>
-                <w:rFonts w:ascii="Calibri" w:eastAsia="Calibri" w:hAnsi="Calibri" w:cs="Calibri"/>
-                <w:b/>
-                <w:bCs/>
-              </w:rPr>
-              <w:t>Dt</w:t>
-            </w:r>
-            <w:proofErr w:type="spellEnd"/>
-            <w:r>
-              <w:rPr>
-                <w:rFonts w:ascii="Calibri" w:eastAsia="Calibri" w:hAnsi="Calibri" w:cs="Calibri"/>
-                <w:b/>
-                <w:bCs/>
-              </w:rPr>
-              <w:t>= Handleiding</w:t>
+              <w:t>Dt= Handleiding</w:t>
             </w:r>
           </w:p>
         </w:tc>
@@ -26477,14 +26265,12 @@
                 <w:rFonts w:ascii="Calibri" w:eastAsia="Calibri" w:hAnsi="Calibri" w:cs="Times New Roman"/>
               </w:rPr>
             </w:pPr>
-            <w:proofErr w:type="spellStart"/>
             <w:r>
               <w:rPr>
                 <w:rFonts w:ascii="Calibri" w:eastAsia="Calibri" w:hAnsi="Calibri" w:cs="Times New Roman"/>
               </w:rPr>
               <w:t>DatumTijd</w:t>
             </w:r>
-            <w:proofErr w:type="spellEnd"/>
           </w:p>
         </w:tc>
         <w:tc>
@@ -28999,10 +28785,10 @@
                                 <w:color w:val="4F81BD"/>
                               </w:rPr>
                               <w:object w:dxaOrig="9900" w:dyaOrig="4512" w14:anchorId="78884CCD">
-                                <v:shape id="_x0000_i1048" type="#_x0000_t75" style="width:352.45pt;height:160.4pt">
+                                <v:shape id="_x0000_i1036" type="#_x0000_t75" style="width:352.45pt;height:160.4pt">
                                   <v:imagedata r:id="rId42" o:title=""/>
                                 </v:shape>
-                                <o:OLEObject Type="Embed" ProgID="Visio.Drawing.11" ShapeID="_x0000_i1048" DrawAspect="Content" ObjectID="_1843131334" r:id="rId43"/>
+                                <o:OLEObject Type="Embed" ProgID="Visio.Drawing.11" ShapeID="_x0000_i1036" DrawAspect="Content" ObjectID="_1849866822" r:id="rId43"/>
                               </w:object>
                             </w:r>
                           </w:p>
@@ -29013,14 +28799,27 @@
                             <w:r>
                               <w:t xml:space="preserve">Figuur </w:t>
                             </w:r>
-                            <w:fldSimple w:instr=" SEQ Figuur \* ARABIC ">
-                              <w:r>
-                                <w:rPr>
-                                  <w:noProof/>
-                                </w:rPr>
-                                <w:t>7</w:t>
-                              </w:r>
-                            </w:fldSimple>
+                            <w:r>
+                              <w:fldChar w:fldCharType="begin"/>
+                            </w:r>
+                            <w:r>
+                              <w:instrText xml:space="preserve"> SEQ Figuur \* ARABIC </w:instrText>
+                            </w:r>
+                            <w:r>
+                              <w:fldChar w:fldCharType="separate"/>
+                            </w:r>
+                            <w:r>
+                              <w:rPr>
+                                <w:noProof/>
+                              </w:rPr>
+                              <w:t>7</w:t>
+                            </w:r>
+                            <w:r>
+                              <w:rPr>
+                                <w:noProof/>
+                              </w:rPr>
+                              <w:fldChar w:fldCharType="end"/>
+                            </w:r>
                             <w:r>
                               <w:t xml:space="preserve"> Datamodel Decor lijsten</w:t>
                             </w:r>
@@ -29056,10 +28855,10 @@
                           <w:color w:val="4F81BD"/>
                         </w:rPr>
                         <w:object w:dxaOrig="9900" w:dyaOrig="4512" w14:anchorId="78884CCD">
-                          <v:shape id="_x0000_i1048" type="#_x0000_t75" style="width:352.45pt;height:160.4pt">
+                          <v:shape id="_x0000_i1036" type="#_x0000_t75" style="width:352.45pt;height:160.4pt">
                             <v:imagedata r:id="rId42" o:title=""/>
                           </v:shape>
-                          <o:OLEObject Type="Embed" ProgID="Visio.Drawing.11" ShapeID="_x0000_i1048" DrawAspect="Content" ObjectID="_1843131334" r:id="rId44"/>
+                          <o:OLEObject Type="Embed" ProgID="Visio.Drawing.11" ShapeID="_x0000_i1036" DrawAspect="Content" ObjectID="_1849866822" r:id="rId44"/>
                         </w:object>
                       </w:r>
                     </w:p>
@@ -29070,14 +28869,27 @@
                       <w:r>
                         <w:t xml:space="preserve">Figuur </w:t>
                       </w:r>
-                      <w:fldSimple w:instr=" SEQ Figuur \* ARABIC ">
-                        <w:r>
-                          <w:rPr>
-                            <w:noProof/>
-                          </w:rPr>
-                          <w:t>7</w:t>
-                        </w:r>
-                      </w:fldSimple>
+                      <w:r>
+                        <w:fldChar w:fldCharType="begin"/>
+                      </w:r>
+                      <w:r>
+                        <w:instrText xml:space="preserve"> SEQ Figuur \* ARABIC </w:instrText>
+                      </w:r>
+                      <w:r>
+                        <w:fldChar w:fldCharType="separate"/>
+                      </w:r>
+                      <w:r>
+                        <w:rPr>
+                          <w:noProof/>
+                        </w:rPr>
+                        <w:t>7</w:t>
+                      </w:r>
+                      <w:r>
+                        <w:rPr>
+                          <w:noProof/>
+                        </w:rPr>
+                        <w:fldChar w:fldCharType="end"/>
+                      </w:r>
                       <w:r>
                         <w:t xml:space="preserve"> Datamodel Decor lijsten</w:t>
                       </w:r>
@@ -30251,10 +30063,10 @@
                                 <w:color w:val="4F81BD"/>
                               </w:rPr>
                               <w:object w:dxaOrig="10979" w:dyaOrig="6252" w14:anchorId="4A6B3BB4">
-                                <v:shape id="_x0000_i1050" type="#_x0000_t75" style="width:305.2pt;height:173.8pt">
+                                <v:shape id="_x0000_i1037" type="#_x0000_t75" style="width:305.4pt;height:174pt">
                                   <v:imagedata r:id="rId45" o:title=""/>
                                 </v:shape>
-                                <o:OLEObject Type="Embed" ProgID="Visio.Drawing.11" ShapeID="_x0000_i1050" DrawAspect="Content" ObjectID="_1843131335" r:id="rId46"/>
+                                <o:OLEObject Type="Embed" ProgID="Visio.Drawing.11" ShapeID="_x0000_i1037" DrawAspect="Content" ObjectID="_1849866823" r:id="rId46"/>
                               </w:object>
                             </w:r>
                           </w:p>
@@ -30266,14 +30078,27 @@
                             <w:r>
                               <w:t xml:space="preserve">Figuur </w:t>
                             </w:r>
-                            <w:fldSimple w:instr=" SEQ Figuur \* ARABIC ">
-                              <w:r>
-                                <w:rPr>
-                                  <w:noProof/>
-                                </w:rPr>
-                                <w:t>9</w:t>
-                              </w:r>
-                            </w:fldSimple>
+                            <w:r>
+                              <w:fldChar w:fldCharType="begin"/>
+                            </w:r>
+                            <w:r>
+                              <w:instrText xml:space="preserve"> SEQ Figuur \* ARABIC </w:instrText>
+                            </w:r>
+                            <w:r>
+                              <w:fldChar w:fldCharType="separate"/>
+                            </w:r>
+                            <w:r>
+                              <w:rPr>
+                                <w:noProof/>
+                              </w:rPr>
+                              <w:t>9</w:t>
+                            </w:r>
+                            <w:r>
+                              <w:rPr>
+                                <w:noProof/>
+                              </w:rPr>
+                              <w:fldChar w:fldCharType="end"/>
+                            </w:r>
                             <w:r>
                               <w:t xml:space="preserve"> Incident Boomstructuur</w:t>
                             </w:r>
@@ -30310,10 +30135,10 @@
                           <w:color w:val="4F81BD"/>
                         </w:rPr>
                         <w:object w:dxaOrig="10979" w:dyaOrig="6252" w14:anchorId="4A6B3BB4">
-                          <v:shape id="_x0000_i1050" type="#_x0000_t75" style="width:305.2pt;height:173.8pt">
+                          <v:shape id="_x0000_i1037" type="#_x0000_t75" style="width:305.4pt;height:174pt">
                             <v:imagedata r:id="rId45" o:title=""/>
                           </v:shape>
-                          <o:OLEObject Type="Embed" ProgID="Visio.Drawing.11" ShapeID="_x0000_i1050" DrawAspect="Content" ObjectID="_1843131335" r:id="rId47"/>
+                          <o:OLEObject Type="Embed" ProgID="Visio.Drawing.11" ShapeID="_x0000_i1037" DrawAspect="Content" ObjectID="_1849866823" r:id="rId47"/>
                         </w:object>
                       </w:r>
                     </w:p>
@@ -30325,14 +30150,27 @@
                       <w:r>
                         <w:t xml:space="preserve">Figuur </w:t>
                       </w:r>
-                      <w:fldSimple w:instr=" SEQ Figuur \* ARABIC ">
-                        <w:r>
-                          <w:rPr>
-                            <w:noProof/>
-                          </w:rPr>
-                          <w:t>9</w:t>
-                        </w:r>
-                      </w:fldSimple>
+                      <w:r>
+                        <w:fldChar w:fldCharType="begin"/>
+                      </w:r>
+                      <w:r>
+                        <w:instrText xml:space="preserve"> SEQ Figuur \* ARABIC </w:instrText>
+                      </w:r>
+                      <w:r>
+                        <w:fldChar w:fldCharType="separate"/>
+                      </w:r>
+                      <w:r>
+                        <w:rPr>
+                          <w:noProof/>
+                        </w:rPr>
+                        <w:t>9</w:t>
+                      </w:r>
+                      <w:r>
+                        <w:rPr>
+                          <w:noProof/>
+                        </w:rPr>
+                        <w:fldChar w:fldCharType="end"/>
+                      </w:r>
                       <w:r>
                         <w:t xml:space="preserve"> Incident Boomstructuur</w:t>
                       </w:r>
@@ -30407,10 +30245,10 @@
                                 <w:szCs w:val="22"/>
                               </w:rPr>
                               <w:object w:dxaOrig="5892" w:dyaOrig="4176" w14:anchorId="4985F830">
-                                <v:shape id="_x0000_i1052" type="#_x0000_t75" style="width:262.5pt;height:185.6pt">
+                                <v:shape id="_x0000_i1038" type="#_x0000_t75" style="width:262.2pt;height:185.4pt">
                                   <v:imagedata r:id="rId48" o:title=""/>
                                 </v:shape>
-                                <o:OLEObject Type="Embed" ProgID="Visio.Drawing.11" ShapeID="_x0000_i1052" DrawAspect="Content" ObjectID="_1843131336" r:id="rId49"/>
+                                <o:OLEObject Type="Embed" ProgID="Visio.Drawing.11" ShapeID="_x0000_i1038" DrawAspect="Content" ObjectID="_1849866824" r:id="rId49"/>
                               </w:object>
                             </w:r>
                           </w:p>
@@ -30421,14 +30259,27 @@
                             <w:r>
                               <w:t xml:space="preserve">Figuur </w:t>
                             </w:r>
-                            <w:fldSimple w:instr=" SEQ Figuur \* ARABIC ">
-                              <w:r>
-                                <w:rPr>
-                                  <w:noProof/>
-                                </w:rPr>
-                                <w:t>9</w:t>
-                              </w:r>
-                            </w:fldSimple>
+                            <w:r>
+                              <w:fldChar w:fldCharType="begin"/>
+                            </w:r>
+                            <w:r>
+                              <w:instrText xml:space="preserve"> SEQ Figuur \* ARABIC </w:instrText>
+                            </w:r>
+                            <w:r>
+                              <w:fldChar w:fldCharType="separate"/>
+                            </w:r>
+                            <w:r>
+                              <w:rPr>
+                                <w:noProof/>
+                              </w:rPr>
+                              <w:t>9</w:t>
+                            </w:r>
+                            <w:r>
+                              <w:rPr>
+                                <w:noProof/>
+                              </w:rPr>
+                              <w:fldChar w:fldCharType="end"/>
+                            </w:r>
                             <w:r>
                               <w:t xml:space="preserve"> Datamodel </w:t>
                             </w:r>
@@ -30468,10 +30319,10 @@
                           <w:szCs w:val="22"/>
                         </w:rPr>
                         <w:object w:dxaOrig="5892" w:dyaOrig="4176" w14:anchorId="4985F830">
-                          <v:shape id="_x0000_i1052" type="#_x0000_t75" style="width:262.5pt;height:185.6pt">
+                          <v:shape id="_x0000_i1038" type="#_x0000_t75" style="width:262.2pt;height:185.4pt">
                             <v:imagedata r:id="rId48" o:title=""/>
                           </v:shape>
-                          <o:OLEObject Type="Embed" ProgID="Visio.Drawing.11" ShapeID="_x0000_i1052" DrawAspect="Content" ObjectID="_1843131336" r:id="rId50"/>
+                          <o:OLEObject Type="Embed" ProgID="Visio.Drawing.11" ShapeID="_x0000_i1038" DrawAspect="Content" ObjectID="_1849866824" r:id="rId50"/>
                         </w:object>
                       </w:r>
                     </w:p>
@@ -30482,14 +30333,27 @@
                       <w:r>
                         <w:t xml:space="preserve">Figuur </w:t>
                       </w:r>
-                      <w:fldSimple w:instr=" SEQ Figuur \* ARABIC ">
-                        <w:r>
-                          <w:rPr>
-                            <w:noProof/>
-                          </w:rPr>
-                          <w:t>9</w:t>
-                        </w:r>
-                      </w:fldSimple>
+                      <w:r>
+                        <w:fldChar w:fldCharType="begin"/>
+                      </w:r>
+                      <w:r>
+                        <w:instrText xml:space="preserve"> SEQ Figuur \* ARABIC </w:instrText>
+                      </w:r>
+                      <w:r>
+                        <w:fldChar w:fldCharType="separate"/>
+                      </w:r>
+                      <w:r>
+                        <w:rPr>
+                          <w:noProof/>
+                        </w:rPr>
+                        <w:t>9</w:t>
+                      </w:r>
+                      <w:r>
+                        <w:rPr>
+                          <w:noProof/>
+                        </w:rPr>
+                        <w:fldChar w:fldCharType="end"/>
+                      </w:r>
                       <w:r>
                         <w:t xml:space="preserve"> Datamodel </w:t>
                       </w:r>
@@ -30988,21 +30852,7 @@
               <w:rPr>
                 <w:rFonts w:ascii="Calibri" w:eastAsia="Calibri" w:hAnsi="Calibri" w:cs="Calibri"/>
               </w:rPr>
-              <w:t xml:space="preserve">die is ingetikt bij Aanmelden onder Gebruikersnaam; bij een Sessie is dat dus: </w:t>
-            </w:r>
-            <w:proofErr w:type="spellStart"/>
-            <w:r>
-              <w:rPr>
-                <w:rFonts w:ascii="Calibri" w:eastAsia="Calibri" w:hAnsi="Calibri" w:cs="Calibri"/>
-              </w:rPr>
-              <w:t>GebruikerId</w:t>
-            </w:r>
-            <w:proofErr w:type="spellEnd"/>
-            <w:r>
-              <w:rPr>
-                <w:rFonts w:ascii="Calibri" w:eastAsia="Calibri" w:hAnsi="Calibri" w:cs="Calibri"/>
-              </w:rPr>
-              <w:t>.</w:t>
+              <w:t>die is ingetikt bij Aanmelden onder Gebruikersnaam; bij een Sessie is dat dus: GebruikerId.</w:t>
             </w:r>
           </w:p>
         </w:tc>
@@ -31133,16 +30983,8 @@
               <w:rPr>
                 <w:rFonts w:ascii="Calibri" w:eastAsia="Calibri" w:hAnsi="Calibri" w:cs="Times New Roman"/>
               </w:rPr>
-              <w:t xml:space="preserve">Apparaat </w:t>
-            </w:r>
-            <w:proofErr w:type="spellStart"/>
-            <w:r>
-              <w:rPr>
-                <w:rFonts w:ascii="Calibri" w:eastAsia="Calibri" w:hAnsi="Calibri" w:cs="Times New Roman"/>
-              </w:rPr>
-              <w:t>id</w:t>
-            </w:r>
-            <w:proofErr w:type="spellEnd"/>
+              <w:t>Apparaat id</w:t>
+            </w:r>
           </w:p>
         </w:tc>
         <w:tc>
@@ -31299,16 +31141,8 @@
               <w:rPr>
                 <w:rFonts w:ascii="Calibri" w:eastAsia="Calibri" w:hAnsi="Calibri" w:cs="Times New Roman"/>
               </w:rPr>
-              <w:t xml:space="preserve">De schermnaam van het in gebruik </w:t>
-            </w:r>
-            <w:proofErr w:type="spellStart"/>
-            <w:r>
-              <w:rPr>
-                <w:rFonts w:ascii="Calibri" w:eastAsia="Calibri" w:hAnsi="Calibri" w:cs="Times New Roman"/>
-              </w:rPr>
-              <w:t>zijndescherm</w:t>
-            </w:r>
-            <w:proofErr w:type="spellEnd"/>
+              <w:t>De schermnaam van het in gebruik zijndescherm</w:t>
+            </w:r>
           </w:p>
         </w:tc>
       </w:tr>
@@ -31361,21 +31195,7 @@
               <w:rPr>
                 <w:rFonts w:ascii="Calibri" w:eastAsia="Calibri" w:hAnsi="Calibri" w:cs="Times New Roman"/>
               </w:rPr>
-              <w:t xml:space="preserve">Optionele aanvullende informatie. </w:t>
-            </w:r>
-            <w:proofErr w:type="spellStart"/>
-            <w:r>
-              <w:rPr>
-                <w:rFonts w:ascii="Calibri" w:eastAsia="Calibri" w:hAnsi="Calibri" w:cs="Times New Roman"/>
-              </w:rPr>
-              <w:t>Bijvoorbbeld</w:t>
-            </w:r>
-            <w:proofErr w:type="spellEnd"/>
-            <w:r>
-              <w:rPr>
-                <w:rFonts w:ascii="Calibri" w:eastAsia="Calibri" w:hAnsi="Calibri" w:cs="Times New Roman"/>
-              </w:rPr>
-              <w:t xml:space="preserve">, bij (Op)zoeken: </w:t>
+              <w:t xml:space="preserve">Optionele aanvullende informatie. Bijvoorbbeld, bij (Op)zoeken: </w:t>
             </w:r>
             <w:r>
               <w:rPr>
@@ -31890,16 +31710,8 @@
               <w:rPr>
                 <w:rFonts w:ascii="Calibri" w:eastAsia="Calibri" w:hAnsi="Calibri" w:cs="Times New Roman"/>
               </w:rPr>
-              <w:t xml:space="preserve">Apparaat </w:t>
-            </w:r>
-            <w:proofErr w:type="spellStart"/>
-            <w:r>
-              <w:rPr>
-                <w:rFonts w:ascii="Calibri" w:eastAsia="Calibri" w:hAnsi="Calibri" w:cs="Times New Roman"/>
-              </w:rPr>
-              <w:t>id</w:t>
-            </w:r>
-            <w:proofErr w:type="spellEnd"/>
+              <w:t>Apparaat id</w:t>
+            </w:r>
           </w:p>
         </w:tc>
         <w:tc>
@@ -32611,20 +32423,8 @@
           <w:szCs w:val="22"/>
           <w14:ligatures w14:val="none"/>
         </w:rPr>
-        <w:t xml:space="preserve">Apparaat </w:t>
-      </w:r>
-      <w:proofErr w:type="spellStart"/>
-      <w:r>
-        <w:rPr>
-          <w:rFonts w:ascii="Calibri" w:eastAsia="Calibri" w:hAnsi="Calibri" w:cs="Times New Roman"/>
-          <w:kern w:val="0"/>
-          <w:sz w:val="22"/>
-          <w:szCs w:val="22"/>
-          <w14:ligatures w14:val="none"/>
-        </w:rPr>
-        <w:t>id</w:t>
-      </w:r>
-      <w:proofErr w:type="spellEnd"/>
+        <w:t>Apparaat id</w:t>
+      </w:r>
       <w:r>
         <w:rPr>
           <w:rFonts w:ascii="Calibri" w:eastAsia="Calibri" w:hAnsi="Calibri" w:cs="Times New Roman"/>
@@ -32793,51 +32593,7 @@
           <w:szCs w:val="22"/>
           <w14:ligatures w14:val="none"/>
         </w:rPr>
-        <w:t xml:space="preserve">De Vereisten uit “Vereisten Archie”, zijn verder uitgewerkt. Onder andere door de  </w:t>
-      </w:r>
-      <w:proofErr w:type="spellStart"/>
-      <w:r>
-        <w:rPr>
-          <w:rFonts w:ascii="Calibri" w:eastAsia="Calibri" w:hAnsi="Calibri" w:cs="Times New Roman"/>
-          <w:kern w:val="0"/>
-          <w:sz w:val="22"/>
-          <w:szCs w:val="22"/>
-          <w14:ligatures w14:val="none"/>
-        </w:rPr>
-        <w:t>de</w:t>
-      </w:r>
-      <w:proofErr w:type="spellEnd"/>
-      <w:r>
-        <w:rPr>
-          <w:rFonts w:ascii="Calibri" w:eastAsia="Calibri" w:hAnsi="Calibri" w:cs="Times New Roman"/>
-          <w:kern w:val="0"/>
-          <w:sz w:val="22"/>
-          <w:szCs w:val="22"/>
-          <w14:ligatures w14:val="none"/>
-        </w:rPr>
-        <w:t xml:space="preserve">  </w:t>
-      </w:r>
-      <w:proofErr w:type="spellStart"/>
-      <w:r>
-        <w:rPr>
-          <w:rFonts w:ascii="Calibri" w:eastAsia="Calibri" w:hAnsi="Calibri" w:cs="Times New Roman"/>
-          <w:kern w:val="0"/>
-          <w:sz w:val="22"/>
-          <w:szCs w:val="22"/>
-          <w14:ligatures w14:val="none"/>
-        </w:rPr>
-        <w:t>Use</w:t>
-      </w:r>
-      <w:proofErr w:type="spellEnd"/>
-      <w:r>
-        <w:rPr>
-          <w:rFonts w:ascii="Calibri" w:eastAsia="Calibri" w:hAnsi="Calibri" w:cs="Times New Roman"/>
-          <w:kern w:val="0"/>
-          <w:sz w:val="22"/>
-          <w:szCs w:val="22"/>
-          <w14:ligatures w14:val="none"/>
-        </w:rPr>
-        <w:t xml:space="preserve"> cases eerder in dit document. We noemen ze de Vereisten (editie 2); zie onderstaande tabel verbijzonderd. De kolom “Dekking” in deze tabel geeft aan waar het aan het vereiste voldaan wordt. Daarmee wordt verantwoord dat en hoe aan de vereisten uit “Vereisten Archie” is voldaan.</w:t>
+        <w:t>De Vereisten uit “Vereisten Archie”, zijn verder uitgewerkt. Onder andere door de  de  Use cases eerder in dit document. We noemen ze de Vereisten (editie 2); zie onderstaande tabel verbijzonderd. De kolom “Dekking” in deze tabel geeft aan waar het aan het vereiste voldaan wordt. Daarmee wordt verantwoord dat en hoe aan de vereisten uit “Vereisten Archie” is voldaan.</w:t>
       </w:r>
     </w:p>
     <w:p>
@@ -33181,7 +32937,6 @@
                 <w14:ligatures w14:val="none"/>
               </w:rPr>
             </w:pPr>
-            <w:proofErr w:type="spellStart"/>
             <w:r>
               <w:rPr>
                 <w:rFonts w:ascii="Calibri" w:eastAsia="Times New Roman" w:hAnsi="Calibri" w:cs="Calibri"/>
@@ -33191,19 +32946,7 @@
                 <w:szCs w:val="22"/>
                 <w14:ligatures w14:val="none"/>
               </w:rPr>
-              <w:t>Use</w:t>
-            </w:r>
-            <w:proofErr w:type="spellEnd"/>
-            <w:r>
-              <w:rPr>
-                <w:rFonts w:ascii="Calibri" w:eastAsia="Times New Roman" w:hAnsi="Calibri" w:cs="Calibri"/>
-                <w:color w:val="000000"/>
-                <w:kern w:val="0"/>
-                <w:sz w:val="22"/>
-                <w:szCs w:val="22"/>
-                <w14:ligatures w14:val="none"/>
-              </w:rPr>
-              <w:t xml:space="preserve"> case Aanmelden </w:t>
+              <w:t xml:space="preserve">Use case Aanmelden </w:t>
             </w:r>
           </w:p>
         </w:tc>
@@ -33316,7 +33059,6 @@
                 <w14:ligatures w14:val="none"/>
               </w:rPr>
             </w:pPr>
-            <w:proofErr w:type="spellStart"/>
             <w:r>
               <w:rPr>
                 <w:rFonts w:ascii="Calibri" w:eastAsia="Times New Roman" w:hAnsi="Calibri" w:cs="Calibri"/>
@@ -33326,19 +33068,7 @@
                 <w:szCs w:val="22"/>
                 <w14:ligatures w14:val="none"/>
               </w:rPr>
-              <w:t>Use</w:t>
-            </w:r>
-            <w:proofErr w:type="spellEnd"/>
-            <w:r>
-              <w:rPr>
-                <w:rFonts w:ascii="Calibri" w:eastAsia="Times New Roman" w:hAnsi="Calibri" w:cs="Calibri"/>
-                <w:color w:val="000000"/>
-                <w:kern w:val="0"/>
-                <w:sz w:val="22"/>
-                <w:szCs w:val="22"/>
-                <w14:ligatures w14:val="none"/>
-              </w:rPr>
-              <w:t xml:space="preserve"> case Aanmelden </w:t>
+              <w:t xml:space="preserve">Use case Aanmelden </w:t>
             </w:r>
           </w:p>
         </w:tc>
@@ -33451,7 +33181,6 @@
                 <w14:ligatures w14:val="none"/>
               </w:rPr>
             </w:pPr>
-            <w:proofErr w:type="spellStart"/>
             <w:r>
               <w:rPr>
                 <w:rFonts w:ascii="Calibri" w:eastAsia="Times New Roman" w:hAnsi="Calibri" w:cs="Calibri"/>
@@ -33461,19 +33190,7 @@
                 <w:szCs w:val="22"/>
                 <w14:ligatures w14:val="none"/>
               </w:rPr>
-              <w:t>Use</w:t>
-            </w:r>
-            <w:proofErr w:type="spellEnd"/>
-            <w:r>
-              <w:rPr>
-                <w:rFonts w:ascii="Calibri" w:eastAsia="Times New Roman" w:hAnsi="Calibri" w:cs="Calibri"/>
-                <w:color w:val="000000"/>
-                <w:kern w:val="0"/>
-                <w:sz w:val="22"/>
-                <w:szCs w:val="22"/>
-                <w14:ligatures w14:val="none"/>
-              </w:rPr>
-              <w:t xml:space="preserve"> case Aanmelden </w:t>
+              <w:t xml:space="preserve">Use case Aanmelden </w:t>
             </w:r>
           </w:p>
         </w:tc>
@@ -33586,7 +33303,6 @@
                 <w14:ligatures w14:val="none"/>
               </w:rPr>
             </w:pPr>
-            <w:proofErr w:type="spellStart"/>
             <w:r>
               <w:rPr>
                 <w:rFonts w:ascii="Calibri" w:eastAsia="Times New Roman" w:hAnsi="Calibri" w:cs="Calibri"/>
@@ -33596,19 +33312,7 @@
                 <w:szCs w:val="22"/>
                 <w14:ligatures w14:val="none"/>
               </w:rPr>
-              <w:t>Use</w:t>
-            </w:r>
-            <w:proofErr w:type="spellEnd"/>
-            <w:r>
-              <w:rPr>
-                <w:rFonts w:ascii="Calibri" w:eastAsia="Times New Roman" w:hAnsi="Calibri" w:cs="Calibri"/>
-                <w:color w:val="000000"/>
-                <w:kern w:val="0"/>
-                <w:sz w:val="22"/>
-                <w:szCs w:val="22"/>
-                <w14:ligatures w14:val="none"/>
-              </w:rPr>
-              <w:t xml:space="preserve"> case Aanmelden </w:t>
+              <w:t xml:space="preserve">Use case Aanmelden </w:t>
             </w:r>
           </w:p>
         </w:tc>
@@ -33721,7 +33425,6 @@
                 <w14:ligatures w14:val="none"/>
               </w:rPr>
             </w:pPr>
-            <w:proofErr w:type="spellStart"/>
             <w:r>
               <w:rPr>
                 <w:rFonts w:ascii="Calibri" w:eastAsia="Times New Roman" w:hAnsi="Calibri" w:cs="Calibri"/>
@@ -33731,19 +33434,7 @@
                 <w:szCs w:val="22"/>
                 <w14:ligatures w14:val="none"/>
               </w:rPr>
-              <w:t>Use</w:t>
-            </w:r>
-            <w:proofErr w:type="spellEnd"/>
-            <w:r>
-              <w:rPr>
-                <w:rFonts w:ascii="Calibri" w:eastAsia="Times New Roman" w:hAnsi="Calibri" w:cs="Calibri"/>
-                <w:color w:val="000000"/>
-                <w:kern w:val="0"/>
-                <w:sz w:val="22"/>
-                <w:szCs w:val="22"/>
-                <w14:ligatures w14:val="none"/>
-              </w:rPr>
-              <w:t xml:space="preserve"> case Log </w:t>
+              <w:t xml:space="preserve">Use case Log </w:t>
             </w:r>
           </w:p>
         </w:tc>
@@ -33879,59 +33570,7 @@
                 <w:lang w:val="en-US"/>
                 <w14:ligatures w14:val="none"/>
               </w:rPr>
-              <w:t xml:space="preserve">Use case </w:t>
-            </w:r>
-            <w:proofErr w:type="spellStart"/>
-            <w:r>
-              <w:rPr>
-                <w:rFonts w:ascii="Calibri" w:eastAsia="Times New Roman" w:hAnsi="Calibri" w:cs="Calibri"/>
-                <w:color w:val="000000"/>
-                <w:kern w:val="0"/>
-                <w:sz w:val="22"/>
-                <w:szCs w:val="22"/>
-                <w:lang w:val="en-US"/>
-                <w14:ligatures w14:val="none"/>
-              </w:rPr>
-              <w:t>Afmelden</w:t>
-            </w:r>
-            <w:proofErr w:type="spellEnd"/>
-            <w:r>
-              <w:rPr>
-                <w:rFonts w:ascii="Calibri" w:eastAsia="Times New Roman" w:hAnsi="Calibri" w:cs="Calibri"/>
-                <w:color w:val="000000"/>
-                <w:kern w:val="0"/>
-                <w:sz w:val="22"/>
-                <w:szCs w:val="22"/>
-                <w:lang w:val="en-US"/>
-                <w14:ligatures w14:val="none"/>
-              </w:rPr>
-              <w:t xml:space="preserve">, </w:t>
-            </w:r>
-            <w:proofErr w:type="spellStart"/>
-            <w:r>
-              <w:rPr>
-                <w:rFonts w:ascii="Calibri" w:eastAsia="Times New Roman" w:hAnsi="Calibri" w:cs="Calibri"/>
-                <w:color w:val="000000"/>
-                <w:kern w:val="0"/>
-                <w:sz w:val="22"/>
-                <w:szCs w:val="22"/>
-                <w:lang w:val="en-US"/>
-                <w14:ligatures w14:val="none"/>
-              </w:rPr>
-              <w:t>Entiteit</w:t>
-            </w:r>
-            <w:proofErr w:type="spellEnd"/>
-            <w:r>
-              <w:rPr>
-                <w:rFonts w:ascii="Calibri" w:eastAsia="Times New Roman" w:hAnsi="Calibri" w:cs="Calibri"/>
-                <w:color w:val="000000"/>
-                <w:kern w:val="0"/>
-                <w:sz w:val="22"/>
-                <w:szCs w:val="22"/>
-                <w:lang w:val="en-US"/>
-                <w14:ligatures w14:val="none"/>
-              </w:rPr>
-              <w:t xml:space="preserve"> Sessie</w:t>
+              <w:t>Use case Afmelden, Entiteit Sessie</w:t>
             </w:r>
           </w:p>
         </w:tc>
@@ -34044,31 +33683,7 @@
                 <w:szCs w:val="22"/>
                 <w14:ligatures w14:val="none"/>
               </w:rPr>
-              <w:t xml:space="preserve">Naast PDF zijn ook andere bestandstypen </w:t>
-            </w:r>
-            <w:proofErr w:type="spellStart"/>
-            <w:r>
-              <w:rPr>
-                <w:rFonts w:ascii="Calibri" w:eastAsia="Times New Roman" w:hAnsi="Calibri" w:cs="Calibri"/>
-                <w:color w:val="000000"/>
-                <w:kern w:val="0"/>
-                <w:sz w:val="22"/>
-                <w:szCs w:val="22"/>
-                <w14:ligatures w14:val="none"/>
-              </w:rPr>
-              <w:t>mogelijk;v</w:t>
-            </w:r>
-            <w:proofErr w:type="spellEnd"/>
-            <w:r>
-              <w:rPr>
-                <w:rFonts w:ascii="Calibri" w:eastAsia="Times New Roman" w:hAnsi="Calibri" w:cs="Calibri"/>
-                <w:color w:val="000000"/>
-                <w:kern w:val="0"/>
-                <w:sz w:val="22"/>
-                <w:szCs w:val="22"/>
-                <w14:ligatures w14:val="none"/>
-              </w:rPr>
-              <w:t xml:space="preserve"> deze kunnen echter niet ingezien worden. Een mail wordt opgeslagen als PDF</w:t>
+              <w:t>Naast PDF zijn ook andere bestandstypen mogelijk;v deze kunnen echter niet ingezien worden. Een mail wordt opgeslagen als PDF</w:t>
             </w:r>
           </w:p>
         </w:tc>
@@ -34546,7 +34161,6 @@
                 <w14:ligatures w14:val="none"/>
               </w:rPr>
             </w:pPr>
-            <w:proofErr w:type="spellStart"/>
             <w:r>
               <w:rPr>
                 <w:rFonts w:ascii="Calibri" w:eastAsia="Times New Roman" w:hAnsi="Calibri" w:cs="Calibri"/>
@@ -34556,19 +34170,7 @@
                 <w:szCs w:val="22"/>
                 <w14:ligatures w14:val="none"/>
               </w:rPr>
-              <w:t>Use</w:t>
-            </w:r>
-            <w:proofErr w:type="spellEnd"/>
-            <w:r>
-              <w:rPr>
-                <w:rFonts w:ascii="Calibri" w:eastAsia="Times New Roman" w:hAnsi="Calibri" w:cs="Calibri"/>
-                <w:color w:val="000000"/>
-                <w:kern w:val="0"/>
-                <w:sz w:val="22"/>
-                <w:szCs w:val="22"/>
-                <w14:ligatures w14:val="none"/>
-              </w:rPr>
-              <w:t xml:space="preserve"> case Raadplegen, Toevoegen en verwijderen</w:t>
+              <w:t>Use case Raadplegen, Toevoegen en verwijderen</w:t>
             </w:r>
           </w:p>
         </w:tc>
@@ -34682,7 +34284,6 @@
                 <w14:ligatures w14:val="none"/>
               </w:rPr>
             </w:pPr>
-            <w:proofErr w:type="spellStart"/>
             <w:r>
               <w:rPr>
                 <w:rFonts w:ascii="Calibri" w:eastAsia="Times New Roman" w:hAnsi="Calibri" w:cs="Calibri"/>
@@ -34692,19 +34293,7 @@
                 <w:szCs w:val="22"/>
                 <w14:ligatures w14:val="none"/>
               </w:rPr>
-              <w:t>Use</w:t>
-            </w:r>
-            <w:proofErr w:type="spellEnd"/>
-            <w:r>
-              <w:rPr>
-                <w:rFonts w:ascii="Calibri" w:eastAsia="Times New Roman" w:hAnsi="Calibri" w:cs="Calibri"/>
-                <w:color w:val="000000"/>
-                <w:kern w:val="0"/>
-                <w:sz w:val="22"/>
-                <w:szCs w:val="22"/>
-                <w14:ligatures w14:val="none"/>
-              </w:rPr>
-              <w:t xml:space="preserve"> case Raadplegen, Toevoegen en verwijderen</w:t>
+              <w:t>Use case Raadplegen, Toevoegen en verwijderen</w:t>
             </w:r>
           </w:p>
         </w:tc>
@@ -34830,7 +34419,6 @@
                 <w14:ligatures w14:val="none"/>
               </w:rPr>
             </w:pPr>
-            <w:proofErr w:type="spellStart"/>
             <w:r>
               <w:rPr>
                 <w:rFonts w:ascii="Calibri" w:eastAsia="Times New Roman" w:hAnsi="Calibri" w:cs="Calibri"/>
@@ -34840,19 +34428,7 @@
                 <w:szCs w:val="22"/>
                 <w14:ligatures w14:val="none"/>
               </w:rPr>
-              <w:t>Use</w:t>
-            </w:r>
-            <w:proofErr w:type="spellEnd"/>
-            <w:r>
-              <w:rPr>
-                <w:rFonts w:ascii="Calibri" w:eastAsia="Times New Roman" w:hAnsi="Calibri" w:cs="Calibri"/>
-                <w:color w:val="000000"/>
-                <w:kern w:val="0"/>
-                <w:sz w:val="22"/>
-                <w:szCs w:val="22"/>
-                <w14:ligatures w14:val="none"/>
-              </w:rPr>
-              <w:t xml:space="preserve"> case Raadplegen, Toevoegen en verwijderen</w:t>
+              <w:t>Use case Raadplegen, Toevoegen en verwijderen</w:t>
             </w:r>
           </w:p>
         </w:tc>
@@ -34918,7 +34494,6 @@
                 <w14:ligatures w14:val="none"/>
               </w:rPr>
             </w:pPr>
-            <w:proofErr w:type="spellStart"/>
             <w:r>
               <w:rPr>
                 <w:rFonts w:ascii="Calibri" w:eastAsia="Times New Roman" w:hAnsi="Calibri" w:cs="Calibri"/>
@@ -34930,7 +34505,6 @@
               </w:rPr>
               <w:t>Gebruikers-interface</w:t>
             </w:r>
-            <w:proofErr w:type="spellEnd"/>
           </w:p>
         </w:tc>
         <w:tc>
@@ -35575,7 +35149,6 @@
                 <w14:ligatures w14:val="none"/>
               </w:rPr>
             </w:pPr>
-            <w:proofErr w:type="spellStart"/>
             <w:r>
               <w:rPr>
                 <w:rFonts w:ascii="Calibri" w:eastAsia="Times New Roman" w:hAnsi="Calibri" w:cs="Calibri"/>
@@ -35587,7 +35160,6 @@
               </w:rPr>
               <w:t>Ont-snapping</w:t>
             </w:r>
-            <w:proofErr w:type="spellEnd"/>
           </w:p>
         </w:tc>
         <w:tc>
@@ -35739,7 +35311,6 @@
               </w:rPr>
               <w:t> </w:t>
             </w:r>
-            <w:proofErr w:type="spellStart"/>
             <w:r>
               <w:rPr>
                 <w:rFonts w:ascii="Calibri" w:eastAsia="Calibri" w:hAnsi="Calibri" w:cs="Times New Roman"/>
@@ -35748,18 +35319,7 @@
                 <w:szCs w:val="22"/>
                 <w14:ligatures w14:val="none"/>
               </w:rPr>
-              <w:t>Metage-gevens</w:t>
-            </w:r>
-            <w:proofErr w:type="spellEnd"/>
-            <w:r>
-              <w:rPr>
-                <w:rFonts w:ascii="Calibri" w:eastAsia="Calibri" w:hAnsi="Calibri" w:cs="Times New Roman"/>
-                <w:kern w:val="0"/>
-                <w:sz w:val="22"/>
-                <w:szCs w:val="22"/>
-                <w14:ligatures w14:val="none"/>
-              </w:rPr>
-              <w:t xml:space="preserve"> (Mg)</w:t>
+              <w:t>Metage-gevens (Mg)</w:t>
             </w:r>
           </w:p>
         </w:tc>
@@ -35857,7 +35417,6 @@
                 <w14:ligatures w14:val="none"/>
               </w:rPr>
             </w:pPr>
-            <w:proofErr w:type="spellStart"/>
             <w:r>
               <w:rPr>
                 <w:rFonts w:ascii="Calibri" w:eastAsia="Times New Roman" w:hAnsi="Calibri" w:cs="Calibri"/>
@@ -35867,19 +35426,7 @@
                 <w:szCs w:val="22"/>
                 <w14:ligatures w14:val="none"/>
               </w:rPr>
-              <w:t>Use</w:t>
-            </w:r>
-            <w:proofErr w:type="spellEnd"/>
-            <w:r>
-              <w:rPr>
-                <w:rFonts w:ascii="Calibri" w:eastAsia="Times New Roman" w:hAnsi="Calibri" w:cs="Calibri"/>
-                <w:color w:val="000000"/>
-                <w:kern w:val="0"/>
-                <w:sz w:val="22"/>
-                <w:szCs w:val="22"/>
-                <w14:ligatures w14:val="none"/>
-              </w:rPr>
-              <w:t xml:space="preserve"> Case: Bewerken</w:t>
+              <w:t>Use Case: Bewerken</w:t>
             </w:r>
           </w:p>
         </w:tc>
@@ -36029,7 +35576,6 @@
                 <w14:ligatures w14:val="none"/>
               </w:rPr>
             </w:pPr>
-            <w:proofErr w:type="spellStart"/>
             <w:r>
               <w:rPr>
                 <w:rFonts w:ascii="Calibri" w:eastAsia="Times New Roman" w:hAnsi="Calibri" w:cs="Calibri"/>
@@ -36039,19 +35585,7 @@
                 <w:szCs w:val="22"/>
                 <w14:ligatures w14:val="none"/>
               </w:rPr>
-              <w:t>Use</w:t>
-            </w:r>
-            <w:proofErr w:type="spellEnd"/>
-            <w:r>
-              <w:rPr>
-                <w:rFonts w:ascii="Calibri" w:eastAsia="Times New Roman" w:hAnsi="Calibri" w:cs="Calibri"/>
-                <w:color w:val="000000"/>
-                <w:kern w:val="0"/>
-                <w:sz w:val="22"/>
-                <w:szCs w:val="22"/>
-                <w14:ligatures w14:val="none"/>
-              </w:rPr>
-              <w:t xml:space="preserve"> Case: Beheren</w:t>
+              <w:t>Use Case: Beheren</w:t>
             </w:r>
           </w:p>
         </w:tc>
@@ -36264,29 +35798,7 @@
                 <w:szCs w:val="22"/>
                 <w14:ligatures w14:val="none"/>
               </w:rPr>
-              <w:t>Vindplaats (</w:t>
-            </w:r>
-            <w:proofErr w:type="spellStart"/>
-            <w:r>
-              <w:rPr>
-                <w:rFonts w:ascii="Calibri" w:eastAsia="Calibri" w:hAnsi="Calibri" w:cs="Times New Roman"/>
-                <w:kern w:val="0"/>
-                <w:sz w:val="22"/>
-                <w:szCs w:val="22"/>
-                <w14:ligatures w14:val="none"/>
-              </w:rPr>
-              <w:t>Vi</w:t>
-            </w:r>
-            <w:proofErr w:type="spellEnd"/>
-            <w:r>
-              <w:rPr>
-                <w:rFonts w:ascii="Calibri" w:eastAsia="Calibri" w:hAnsi="Calibri" w:cs="Times New Roman"/>
-                <w:kern w:val="0"/>
-                <w:sz w:val="22"/>
-                <w:szCs w:val="22"/>
-                <w14:ligatures w14:val="none"/>
-              </w:rPr>
-              <w:t>)</w:t>
+              <w:t>Vindplaats (Vi)</w:t>
             </w:r>
           </w:p>
         </w:tc>
@@ -36576,55 +36088,7 @@
                 <w:szCs w:val="22"/>
                 <w14:ligatures w14:val="none"/>
               </w:rPr>
-              <w:t xml:space="preserve">Entiteit Document, </w:t>
-            </w:r>
-            <w:proofErr w:type="spellStart"/>
-            <w:r>
-              <w:rPr>
-                <w:rFonts w:ascii="Calibri" w:eastAsia="Times New Roman" w:hAnsi="Calibri" w:cs="Calibri"/>
-                <w:color w:val="000000"/>
-                <w:kern w:val="0"/>
-                <w:sz w:val="22"/>
-                <w:szCs w:val="22"/>
-                <w14:ligatures w14:val="none"/>
-              </w:rPr>
-              <w:t>Use</w:t>
-            </w:r>
-            <w:proofErr w:type="spellEnd"/>
-            <w:r>
-              <w:rPr>
-                <w:rFonts w:ascii="Calibri" w:eastAsia="Times New Roman" w:hAnsi="Calibri" w:cs="Calibri"/>
-                <w:color w:val="000000"/>
-                <w:kern w:val="0"/>
-                <w:sz w:val="22"/>
-                <w:szCs w:val="22"/>
-                <w14:ligatures w14:val="none"/>
-              </w:rPr>
-              <w:t xml:space="preserve"> Case Toevoegen, bewerken en verwijderen, Document </w:t>
-            </w:r>
-            <w:proofErr w:type="spellStart"/>
-            <w:r>
-              <w:rPr>
-                <w:rFonts w:ascii="Calibri" w:eastAsia="Times New Roman" w:hAnsi="Calibri" w:cs="Calibri"/>
-                <w:color w:val="000000"/>
-                <w:kern w:val="0"/>
-                <w:sz w:val="22"/>
-                <w:szCs w:val="22"/>
-                <w14:ligatures w14:val="none"/>
-              </w:rPr>
-              <w:t>Gebrui</w:t>
-            </w:r>
-            <w:proofErr w:type="spellEnd"/>
-            <w:r>
-              <w:rPr>
-                <w:rFonts w:ascii="Calibri" w:eastAsia="Times New Roman" w:hAnsi="Calibri" w:cs="Calibri"/>
-                <w:color w:val="000000"/>
-                <w:kern w:val="0"/>
-                <w:sz w:val="22"/>
-                <w:szCs w:val="22"/>
-                <w14:ligatures w14:val="none"/>
-              </w:rPr>
-              <w:t xml:space="preserve"> Archie</w:t>
+              <w:t>Entiteit Document, Use Case Toevoegen, bewerken en verwijderen, Document Gebrui Archie</w:t>
             </w:r>
           </w:p>
         </w:tc>
@@ -36748,7 +36212,6 @@
                 <w14:ligatures w14:val="none"/>
               </w:rPr>
             </w:pPr>
-            <w:proofErr w:type="spellStart"/>
             <w:r>
               <w:rPr>
                 <w:rFonts w:ascii="Calibri" w:eastAsia="Calibri" w:hAnsi="Calibri" w:cs="Times New Roman"/>
@@ -36757,18 +36220,7 @@
                 <w:szCs w:val="22"/>
                 <w14:ligatures w14:val="none"/>
               </w:rPr>
-              <w:t>Use</w:t>
-            </w:r>
-            <w:proofErr w:type="spellEnd"/>
-            <w:r>
-              <w:rPr>
-                <w:rFonts w:ascii="Calibri" w:eastAsia="Calibri" w:hAnsi="Calibri" w:cs="Times New Roman"/>
-                <w:kern w:val="0"/>
-                <w:sz w:val="22"/>
-                <w:szCs w:val="22"/>
-                <w14:ligatures w14:val="none"/>
-              </w:rPr>
-              <w:t xml:space="preserve"> Case Log, hoofdstuk Logboek</w:t>
+              <w:t>Use Case Log, hoofdstuk Logboek</w:t>
             </w:r>
           </w:p>
         </w:tc>
@@ -36800,7 +36252,6 @@
                 <w14:ligatures w14:val="none"/>
               </w:rPr>
             </w:pPr>
-            <w:proofErr w:type="spellStart"/>
             <w:r>
               <w:rPr>
                 <w:rFonts w:ascii="Calibri" w:eastAsia="Calibri" w:hAnsi="Calibri" w:cs="Times New Roman"/>
@@ -36809,18 +36260,7 @@
                 <w:szCs w:val="22"/>
                 <w14:ligatures w14:val="none"/>
               </w:rPr>
-              <w:t>Af-scherming</w:t>
-            </w:r>
-            <w:proofErr w:type="spellEnd"/>
-            <w:r>
-              <w:rPr>
-                <w:rFonts w:ascii="Calibri" w:eastAsia="Calibri" w:hAnsi="Calibri" w:cs="Times New Roman"/>
-                <w:kern w:val="0"/>
-                <w:sz w:val="22"/>
-                <w:szCs w:val="22"/>
-                <w14:ligatures w14:val="none"/>
-              </w:rPr>
-              <w:t xml:space="preserve"> (A)</w:t>
+              <w:t>Af-scherming (A)</w:t>
             </w:r>
           </w:p>
         </w:tc>
@@ -36847,7 +36287,6 @@
                 <w14:ligatures w14:val="none"/>
               </w:rPr>
             </w:pPr>
-            <w:proofErr w:type="spellStart"/>
             <w:r>
               <w:rPr>
                 <w:rFonts w:ascii="Calibri" w:eastAsia="Times New Roman" w:hAnsi="Calibri" w:cs="Calibri"/>
@@ -36859,7 +36298,6 @@
               </w:rPr>
               <w:t>Vertrouwe-lijkheid</w:t>
             </w:r>
-            <w:proofErr w:type="spellEnd"/>
           </w:p>
         </w:tc>
         <w:tc>
@@ -36930,21 +36368,8 @@
                 <w:szCs w:val="22"/>
                 <w14:ligatures w14:val="none"/>
               </w:rPr>
-              <w:t xml:space="preserve">Entiteit Document: </w:t>
-            </w:r>
-            <w:proofErr w:type="spellStart"/>
-            <w:r>
-              <w:rPr>
-                <w:rFonts w:ascii="Calibri" w:eastAsia="Times New Roman" w:hAnsi="Calibri" w:cs="Calibri"/>
-                <w:color w:val="000000"/>
-                <w:kern w:val="0"/>
-                <w:sz w:val="22"/>
-                <w:szCs w:val="22"/>
-                <w14:ligatures w14:val="none"/>
-              </w:rPr>
-              <w:t>BeperkingInGebruik</w:t>
-            </w:r>
-            <w:proofErr w:type="spellEnd"/>
+              <w:t>Entiteit Document: BeperkingInGebruik</w:t>
+            </w:r>
           </w:p>
         </w:tc>
       </w:tr>
@@ -36977,7 +36402,6 @@
               </w:rPr>
             </w:pPr>
             <w:bookmarkStart w:id="86" w:name="_Hlk131329700" w:colFirst="0" w:colLast="2"/>
-            <w:proofErr w:type="spellStart"/>
             <w:r>
               <w:rPr>
                 <w:rFonts w:ascii="Calibri" w:eastAsia="Times New Roman" w:hAnsi="Calibri" w:cs="Calibri"/>
@@ -36988,61 +36412,8 @@
                 <w:lang w:val="de-DE"/>
                 <w14:ligatures w14:val="none"/>
               </w:rPr>
-              <w:t>E-mail</w:t>
-            </w:r>
-            <w:proofErr w:type="spellEnd"/>
-            <w:r>
-              <w:rPr>
-                <w:rFonts w:ascii="Calibri" w:eastAsia="Times New Roman" w:hAnsi="Calibri" w:cs="Calibri"/>
-                <w:color w:val="000000"/>
-                <w:kern w:val="0"/>
-                <w:sz w:val="22"/>
-                <w:szCs w:val="22"/>
-                <w:lang w:val="de-DE"/>
-                <w14:ligatures w14:val="none"/>
-              </w:rPr>
-              <w:t xml:space="preserve"> en </w:t>
-            </w:r>
-            <w:proofErr w:type="spellStart"/>
-            <w:r>
-              <w:rPr>
-                <w:rFonts w:ascii="Calibri" w:eastAsia="Times New Roman" w:hAnsi="Calibri" w:cs="Calibri"/>
-                <w:color w:val="000000"/>
-                <w:kern w:val="0"/>
-                <w:sz w:val="22"/>
-                <w:szCs w:val="22"/>
-                <w:lang w:val="de-DE"/>
-                <w14:ligatures w14:val="none"/>
-              </w:rPr>
-              <w:t>Whattsapp</w:t>
-            </w:r>
-            <w:proofErr w:type="spellEnd"/>
-            <w:r>
-              <w:rPr>
-                <w:rFonts w:ascii="Calibri" w:eastAsia="Times New Roman" w:hAnsi="Calibri" w:cs="Calibri"/>
-                <w:color w:val="000000"/>
-                <w:kern w:val="0"/>
-                <w:sz w:val="22"/>
-                <w:szCs w:val="22"/>
-                <w:lang w:val="de-DE"/>
-                <w14:ligatures w14:val="none"/>
-              </w:rPr>
-              <w:t xml:space="preserve"> </w:t>
-            </w:r>
-            <w:proofErr w:type="spellStart"/>
-            <w:r>
-              <w:rPr>
-                <w:rFonts w:ascii="Calibri" w:eastAsia="Times New Roman" w:hAnsi="Calibri" w:cs="Calibri"/>
-                <w:color w:val="000000"/>
-                <w:kern w:val="0"/>
-                <w:sz w:val="22"/>
-                <w:szCs w:val="22"/>
-                <w:lang w:val="de-DE"/>
-                <w14:ligatures w14:val="none"/>
-              </w:rPr>
-              <w:t>bijlagen</w:t>
-            </w:r>
-            <w:proofErr w:type="spellEnd"/>
+              <w:t>E-mail en Whattsapp bijlagen</w:t>
+            </w:r>
           </w:p>
         </w:tc>
         <w:tc>
@@ -37345,7 +36716,6 @@
                 <w14:ligatures w14:val="none"/>
               </w:rPr>
             </w:pPr>
-            <w:proofErr w:type="spellStart"/>
             <w:r>
               <w:rPr>
                 <w:rFonts w:ascii="Calibri" w:eastAsia="Calibri" w:hAnsi="Calibri" w:cs="Times New Roman"/>
@@ -37367,7 +36737,6 @@
               </w:rPr>
               <w:t>Pmerking</w:t>
             </w:r>
-            <w:proofErr w:type="spellEnd"/>
           </w:p>
           <w:p>
             <w:pPr>
@@ -37997,7 +37366,6 @@
       </w:pPr>
       <w:hyperlink r:id="rId51" w:anchor="collapse-102684" w:tooltip="Close this item" w:history="1">
         <w:bookmarkStart w:id="94" w:name="_Toc195086630"/>
-        <w:proofErr w:type="spellStart"/>
         <w:r>
           <w:rPr>
             <w:rFonts w:ascii="Cambria" w:eastAsia="Times New Roman" w:hAnsi="Cambria" w:cs="Times New Roman"/>
@@ -38012,7 +37380,6 @@
           <w:t>BeperkingInGebruik</w:t>
         </w:r>
         <w:bookmarkEnd w:id="94"/>
-        <w:proofErr w:type="spellEnd"/>
       </w:hyperlink>
     </w:p>
     <w:p>
@@ -38056,7 +37423,6 @@
       </w:pPr>
       <w:hyperlink r:id="rId52" w:anchor="collapse-102684" w:tooltip="Close this item" w:history="1">
         <w:bookmarkStart w:id="95" w:name="_Toc195086631"/>
-        <w:proofErr w:type="spellStart"/>
         <w:r>
           <w:rPr>
             <w:rFonts w:ascii="Cambria" w:eastAsia="Times New Roman" w:hAnsi="Cambria" w:cs="Times New Roman"/>
@@ -38071,7 +37437,6 @@
           <w:t>BeperkingInOnderwerp</w:t>
         </w:r>
         <w:bookmarkEnd w:id="95"/>
-        <w:proofErr w:type="spellEnd"/>
       </w:hyperlink>
     </w:p>
     <w:p>
@@ -43435,7 +42800,6 @@
   <w:style w:type="character" w:default="1" w:styleId="Standaardalinea-lettertype">
     <w:name w:val="Default Paragraph Font"/>
     <w:uiPriority w:val="1"/>
-    <w:semiHidden/>
     <w:unhideWhenUsed/>
   </w:style>
   <w:style w:type="table" w:default="1" w:styleId="Standaardtabel">

</xml_diff>